<commit_message>
v10.0.0 (supplement): condense the many long explanatory notes to short one-line caveats; all data tables kept verbatim; verify 239/47/12.
</commit_message>
<xml_diff>
--- a/manuscript/Supplementary_Materials_v7.docx
+++ b/manuscript/Supplementary_Materials_v7.docx
@@ -35,7 +35,7 @@
           <w:i/>
           <w:iCs/>
         </w:rPr>
-        <w:t xml:space="preserve">All supplementary values are generated by `code/survey_analysis_v4.R` (core), `code/survey_analysis_v5.R`, `code/survey_analysis_v6.R` (construct-validity and robustness extensions) and `code/survey_analysis_v7.R` (per-model degrees-of-freedom audit, IPW weight decomposition, severity-adjusted AMD age model and late-AMD phenotype check), consolidated in `results/tables/numbers_v7.csv`, and audited by `code/verify_v7.py`, which enforces the sample-denominator assertions against the raw analytic dataset, verifies the per-model design/residual degrees-of-freedom and CI/P consistency, and re-checks every in-text value. Supplementary figures are produced by `code/build_figures_v13.py`. Every diagnosis-discordance denominator is restricted to participants who answered the relevant self-report item (responders-only). Proportion confidence intervals are design-based logit-transformed (`svyciprop(method="logit")`) and lie within 0–100%; adjusted-odds-ratio intervals use the design-based t critical value on each model's residual degrees of freedom, matching the Wald P values. Supplementary tables and figures are numbered S1–S9 and S1–S2, respectively, by first appearance in the main text; sub-parts are lettered (a)/(b)/(c) within a single table rather than given nested "S2b/S2c"-style numbers.</w:t>
+        <w:t xml:space="preserve">Supplementary values are generated by `code/survey_analysis_v4.R`–`v7.R`, consolidated in `results/tables/numbers_v7.csv` and audited by `code/verify_v7.py`; figures by `code/build_figures_v13.py`. Discordance denominators are responders-only. Proportion CIs are design-based logit (`svyciprop(method="logit")`); adjusted-odds-ratio CIs use the design t critical value at each model's residual degrees of freedom, matching the Wald P values. Tables and figures are numbered by first appearance in the main text; sub-parts are lettered (a)/(b)/(c) within a table.</w:t>
       </w:r>
     </w:p>
     <w:p>
@@ -132,7 +132,7 @@
           <w:i/>
           <w:iCs/>
         </w:rPr>
-        <w:t xml:space="preserve">Naive (gradable-only) versus inverse-probability-weighted whole-population prevalence of any retinopathy and any AMD under a base (age, sex, race/ethnicity) and an extended (+ diabetes, insurance, education) gradability model. IPW shifts each estimate by ≤ 0.6 percentage points, indicating that observable gradable-vs-ungradable differences do not materially move the descriptive prevalence. Full weight decomposition in Supplementary Table S8.</w:t>
+        <w:t xml:space="preserve">Naive (gradable-only) versus inverse-probability-weighted prevalence of any retinopathy and any AMD under base (age, sex, race) and extended (+ diabetes, insurance, education) gradability models; bars show 95% CIs. IPW shifts each estimate by ≤0.6 percentage points. Weight decomposition in Supplementary Table S8.</w:t>
       </w:r>
     </w:p>
     <w:p>
@@ -219,7 +219,7 @@
           <w:i/>
           <w:iCs/>
         </w:rPr>
-        <w:t xml:space="preserve">NHANES retinal-photograph grading (2005–2008, weighted 6.58%) compared with NHIS self-reported macular degeneration (2016, survey-weighted crude 2.66% and directly age-standardised 2.45% to the NHANES 40+ structure). The surveys differ in instrument, calendar year and measurement method and are shown only as a contextual comparison; bars show 95% CIs. The age-standardised CI is conditional on the fixed NHANES-derived standard weights. Corresponds to the main-text cross-survey benchmark paragraph; numeric detail in Supplementary Table S4.</w:t>
+        <w:t xml:space="preserve">NHANES objectively graded AMD (2005–2008, weighted 6.58%) versus NHIS self-reported macular degeneration (2016; crude 2.66%, age-standardised 2.45% to the NHANES 40+ structure); bars show 95% CIs. The surveys differ in instrument, year and method and are shown only as a contextual comparison. Detail in Supplementary Table S4.</w:t>
       </w:r>
     </w:p>
     <w:p>
@@ -252,7 +252,7 @@
         <w:rPr>
           <w:rFonts w:ascii="Arial" w:eastAsia="Microsoft YaHei"/>
         </w:rPr>
-        <w:t xml:space="preserve">Official variable labels below are taken verbatim from the NHANES public-use data files; valid-value distributions are counts in the examined ≥40 sample. Exact item wording for the self-report questions should be read from the corresponding NHANES questionnaire (Reference 13) — we reproduce the intent as coded in the data, not a paraphrased "verbatim" question, to avoid introducing wording errors.</w:t>
+        <w:t xml:space="preserve">Official labels are taken verbatim from the NHANES public-use files; valid-value counts are in the examined ≥40 sample. Exact self-report wording should be read from the NHANES questionnaire (Reference 13).</w:t>
       </w:r>
     </w:p>
     <w:tbl>
@@ -2780,27 +2780,7 @@
           <w:i/>
           <w:iCs/>
         </w:rPr>
-        <w:t xml:space="preserve"> variables (`OPDU</w:t>
-      </w:r>
-      <w:r>
-        <w:rPr>
-          <w:rFonts w:ascii="Arial" w:eastAsia="Microsoft YaHei"/>
-        </w:rPr>
-        <w:t xml:space="preserve">`); eye-level measurements are aggregated, never treated as independent samples. The self-report items are used as </w:t>
-      </w:r>
-      <w:r>
-        <w:rPr>
-          <w:rFonts w:ascii="Arial" w:eastAsia="Microsoft YaHei"/>
-          <w:b/>
-          <w:bCs/>
-        </w:rPr>
-        <w:t xml:space="preserve">patient-reported</w:t>
-      </w:r>
-      <w:r>
-        <w:rPr>
-          <w:rFonts w:ascii="Arial" w:eastAsia="Microsoft YaHei"/>
-        </w:rPr>
-        <w:t xml:space="preserve"> constructs. Valid-value counts are from the full examined ≥40 sample and thus differ from the disease-restricted analytic denominators in Table S5.*</w:t>
+        <w:t xml:space="preserve"> variables; the self-report items are patient-reported constructs. Valid-value counts are for the full examined ≥40 sample and differ from the disease-restricted denominators in Table S5.</w:t>
       </w:r>
     </w:p>
     <w:p>
@@ -3516,51 +3496,7 @@
           <w:i/>
           <w:iCs/>
         </w:rPr>
-        <w:t xml:space="preserve">PSUs are counted as unique stratum×PSU combinations. NHANES samples two PSUs per stratum, so the total PSU count in a subset is roughly twice the number of strata (59–62), not 2; `SDMVPSU` itself only carries the within-stratum labels 1 and 2. Design degrees of freedom equal (total PSUs − strata), and are reduced further where a complete-case subset leaves a stratum with a single contributing PSU. These values were obtained with `survey::degf()` on each subset design. </w:t>
-      </w:r>
-      <w:r>
-        <w:rPr>
-          <w:rFonts w:ascii="Arial" w:eastAsia="Microsoft YaHei"/>
-          <w:i/>
-          <w:iCs/>
-        </w:rPr>
-        <w:t xml:space="preserve">Design df, model residual df and the `summary.svyglm` df are distinct quantities and are not interchangeable</w:t>
-      </w:r>
-      <w:r>
-        <w:rPr>
-          <w:rFonts w:ascii="Arial" w:eastAsia="Microsoft YaHei"/>
-          <w:i/>
-          <w:iCs/>
-        </w:rPr>
-        <w:t xml:space="preserve">: `survey` performs regression inference at the model </w:t>
-      </w:r>
-      <w:r>
-        <w:rPr>
-          <w:rFonts w:ascii="Arial" w:eastAsia="Microsoft YaHei"/>
-        </w:rPr>
-        <w:t xml:space="preserve">residual</w:t>
-      </w:r>
-      <w:r>
-        <w:rPr>
-          <w:rFonts w:ascii="Arial" w:eastAsia="Microsoft YaHei"/>
-          <w:i/>
-          <w:iCs/>
-        </w:rPr>
-        <w:t xml:space="preserve"> df, which equals `degf(design) − model rank + 1`. Panel (b) exports, for every model reported in this study, the design df, the model rank, the resulting residual df, the exact t-multiplier `qt(0.975, df)`, and the coefficient/SE/aOR/CI/raw-P/Holm-P all read from the </w:t>
-      </w:r>
-      <w:r>
-        <w:rPr>
-          <w:rFonts w:ascii="Arial" w:eastAsia="Microsoft YaHei"/>
-        </w:rPr>
-        <w:t xml:space="preserve">same fitted model object</w:t>
-      </w:r>
-      <w:r>
-        <w:rPr>
-          <w:rFonts w:ascii="Arial" w:eastAsia="Microsoft YaHei"/>
-          <w:i/>
-          <w:iCs/>
-        </w:rPr>
-        <w:t xml:space="preserve">, so that confidence intervals and P values cannot drift apart from one another. For the DR eye-care model the residual df is 13 (degf 22 − rank 10 + 1), and this single df reproduces both the reported exam odds ratio 0.30 (0.10–0.92) and P = 0.038.</w:t>
+        <w:t xml:space="preserve">PSUs are unique stratum×PSU combinations; design df = total PSUs − strata, obtained with `survey::degf()`. Design df, model residual df and the `summary.svyglm` df are distinct — regression inference uses residual df = degf − rank + 1 (panel b).</w:t>
       </w:r>
     </w:p>
     <w:p>
@@ -8184,69 +8120,31 @@
           <w:i/>
           <w:iCs/>
         </w:rPr>
-        <w:t xml:space="preserve">The aORs, CIs, SEs, raw P and Holm P in every row were extracted programmatically from the single `svyglm` (quasibinomial) object for that model (see `t_model_audit_v7.csv` / keys `audit|</w:t>
+        <w:t xml:space="preserve">Every aOR, CI, SE, raw P and Holm P above was extracted programmatically from the single `svyglm` object for that model (keys `audit|</w:t>
       </w:r>
       <w:r>
         <w:rPr>
           <w:rFonts w:ascii="Consolas" w:cs="Consolas" w:eastAsia="Consolas" w:hAnsi="Consolas"/>
         </w:rPr>
-        <w:t xml:space="preserve"> and </w:t>
+        <w:t xml:space="preserve"> in </w:t>
       </w:r>
       <w:r>
         <w:rPr>
           <w:rFonts w:ascii="Arial" w:eastAsia="Microsoft YaHei"/>
         </w:rPr>
-        <w:t xml:space="preserve">audit</w:t>
+        <w:t xml:space="preserve">numbers_v7.csv</w:t>
       </w:r>
       <w:r>
         <w:rPr>
-          <w:rFonts w:ascii="Arial" w:eastAsia="Microsoft YaHei"/>
-          <w:i/>
-          <w:iCs/>
+          <w:rFonts w:ascii="Consolas" w:cs="Consolas" w:eastAsia="Consolas" w:hAnsi="Consolas"/>
         </w:rPr>
-        <w:t xml:space="preserve">df|*` in `numbers</w:t>
+        <w:t xml:space="preserve">); CIs use </w:t>
       </w:r>
       <w:r>
         <w:rPr>
           <w:rFonts w:ascii="Arial" w:eastAsia="Microsoft YaHei"/>
         </w:rPr>
-        <w:t xml:space="preserve">v7.csv</w:t>
-      </w:r>
-      <w:r>
-        <w:rPr>
-          <w:rFonts w:ascii="Consolas" w:cs="Consolas" w:eastAsia="Consolas" w:hAnsi="Consolas"/>
-        </w:rPr>
-        <w:t xml:space="preserve">); none were hand-filled or computed from a different df than the P value. The 95% CI uses </w:t>
-      </w:r>
-      <w:r>
-        <w:rPr>
-          <w:rFonts w:ascii="Arial" w:eastAsia="Microsoft YaHei"/>
-        </w:rPr>
-        <w:t xml:space="preserve">exp(coef ± t(0.975, dfres)·SE)</w:t>
-      </w:r>
-      <w:r>
-        <w:rPr>
-          <w:rFonts w:ascii="Consolas" w:cs="Consolas" w:eastAsia="Consolas" w:hAnsi="Consolas"/>
-        </w:rPr>
-        <w:t xml:space="preserve"> at the residual df in the same row, and the raw P is the Wald-</w:t>
-      </w:r>
-      <w:r>
-        <w:rPr>
-          <w:rFonts w:ascii="Arial" w:eastAsia="Microsoft YaHei"/>
-        </w:rPr>
-        <w:t xml:space="preserve">t</w:t>
-      </w:r>
-      <w:r>
-        <w:rPr>
-          <w:rFonts w:ascii="Consolas" w:cs="Consolas" w:eastAsia="Consolas" w:hAnsi="Consolas"/>
-        </w:rPr>
-        <w:t xml:space="preserve"> P from </w:t>
-      </w:r>
-      <w:r>
-        <w:rPr>
-          <w:rFonts w:ascii="Arial" w:eastAsia="Microsoft YaHei"/>
-        </w:rPr>
-        <w:t xml:space="preserve">summary()` at that same df — the two are guaranteed mutually consistent. Holm adjustment is applied within each model's set of tested terms. The two models whose headline figures the reviewer asked us to re-verify are the DR core model (poverty-income 1.34) and the DR eye-care model (recent dilated exam 0.30, 0.10–0.92, P = 0.038, Holm P = 0.266, residual df = 13): both are reproduced here exactly as reported in the main text, from one model object.*</w:t>
+        <w:t xml:space="preserve">exp(coef ± t(0.975, dfres)·SE)` at the residual df in the same row, so CI and P are mutually consistent. Holm adjustment is applied within each model.*</w:t>
       </w:r>
     </w:p>
     <w:p>
@@ -8266,7 +8164,7 @@
         <w:rPr>
           <w:rFonts w:ascii="Arial" w:eastAsia="Microsoft YaHei"/>
         </w:rPr>
-        <w:t xml:space="preserve"> Outcome = no self-reported diabetic-eye diagnosis; all covariates shown. </w:t>
+        <w:t xml:space="preserve"> Outcome = no self-reported diabetic-eye diagnosis. </w:t>
       </w:r>
       <w:r>
         <w:rPr>
@@ -8274,13 +8172,13 @@
           <w:b/>
           <w:bCs/>
         </w:rPr>
-        <w:t xml:space="preserve">Mild NPDR is the severity reference category</w:t>
+        <w:t xml:space="preserve">Mild NPDR is the severity reference</w:t>
       </w:r>
       <w:r>
         <w:rPr>
           <w:rFonts w:ascii="Arial" w:eastAsia="Microsoft YaHei"/>
         </w:rPr>
-        <w:t xml:space="preserve"> because every participant in this cohort had objectively graded retinopathy (OPDURL4 levels present: mild 197, moderate 85, severe 31).</w:t>
+        <w:t xml:space="preserve"> (levels present: mild 197, moderate 85, severe 31).</w:t>
       </w:r>
     </w:p>
     <w:tbl>
@@ -9372,23 +9270,7 @@
           <w:i/>
           <w:iCs/>
         </w:rPr>
-        <w:t xml:space="preserve">This model is </w:t>
-      </w:r>
-      <w:r>
-        <w:rPr>
-          <w:rFonts w:ascii="Arial" w:eastAsia="Microsoft YaHei"/>
-          <w:i/>
-          <w:iCs/>
-        </w:rPr>
-        <w:t xml:space="preserve">exploratory</w:t>
-      </w:r>
-      <w:r>
-        <w:rPr>
-          <w:rFonts w:ascii="Arial" w:eastAsia="Microsoft YaHei"/>
-          <w:i/>
-          <w:iCs/>
-        </w:rPr>
-        <w:t xml:space="preserve">; intervals use the design-based t critical value on the model's residual degrees of freedom (df = 13), so each aOR, interval and P come from one quasi-binomial Wald t test. Only the severe-or-proliferative retinopathy category remained statistically significant after within-model Holm correction. Unadjusted, 82.0% (70.1–89.9) of adults not examined within 12 months (n = 106) reported no diabetic-eye diagnosis versus 64.5% (55.9–72.2) of those examined (n = 207). Model-adjusted (g-computation) predicted probability of no reported diagnosis: 81.8% without a recent examination vs 62.4% with one (−19.4 percentage points, descriptive point estimates; a design-based interval was not reliable given the sparse primary-stratum structure and is therefore not reported — see main-text Figure 3). Exploratory eye-care × moderate-or-worse interaction: aOR 1.61 (0.24–10.79), P = 0.59 — no evidence of effect modification.</w:t>
+        <w:t xml:space="preserve">Exploratory model; intervals use the design t critical value at residual df = 13. Only severe-or-proliferative retinopathy stayed significant after within-model Holm correction. Unadjusted, 82.0% (70.1–89.9) of those not examined within 12 months (n = 106) reported no diabetic-eye diagnosis versus 64.5% (55.9–72.2) of those examined (n = 207); model-adjusted (g-computation) predicted probability 81.8% vs 62.4% — descriptive point estimates, a design interval was unreliable given the sparse strata and is not reported (see main-text Figure 3). Eye-care × severity interaction aOR 1.61 (0.24–10.79), P = 0.59 — no evidence of effect modification.</w:t>
       </w:r>
     </w:p>
     <w:p>
@@ -9419,7 +9301,7 @@
         <w:rPr>
           <w:rFonts w:ascii="Arial" w:eastAsia="Microsoft YaHei"/>
         </w:rPr>
-        <w:t xml:space="preserve"> for the two high-missingness covariates (education, income). The complete-case column is the core model (n = 187, education and income required complete); the missing-indicator column retains all 313 responders by median-filling income (with an income-missingness flag) and assigning missing education the "HS-or-more" placeholder with an education-missingness flag; the reduced column drops education and keeps income (n = 283); the multiple-imputation column uses chained equations (m = 20) over outcome, demographics, severity, cycle, income and education, pooled with Rubin's rules within the survey design (n = 313).</w:t>
+        <w:t xml:space="preserve"> for the two high-missingness covariates (education, income): complete-case core model (n = 187); missing-indicator model retaining all 313 responders (median-filled income + missingness flags); reduced model dropping education (n = 283); and multiple imputation (m = 20, Rubin-pooled, n = 313).</w:t>
       </w:r>
     </w:p>
     <w:tbl>
@@ -10479,23 +10361,7 @@
           <w:i/>
           <w:iCs/>
         </w:rPr>
-        <w:t xml:space="preserve">The income point estimate is above 1 in every specification (1.34–1.48), so the </w:t>
-      </w:r>
-      <w:r>
-        <w:rPr>
-          <w:rFonts w:ascii="Arial" w:eastAsia="Microsoft YaHei"/>
-          <w:i/>
-          <w:iCs/>
-        </w:rPr>
-        <w:t xml:space="preserve">direction is stable</w:t>
-      </w:r>
-      <w:r>
-        <w:rPr>
-          <w:rFonts w:ascii="Arial" w:eastAsia="Microsoft YaHei"/>
-          <w:i/>
-          <w:iCs/>
-        </w:rPr>
-        <w:t xml:space="preserve">, but its precision depends on missing-data handling: non-significant in the complete-case core model, nominally significant when education is dropped (1.46, P = 0.017), under multiple imputation (1.38, P = 0.037) and in the median-filled missing-indicator model (1.48, P = 0.013). Higher income is therefore treated as a tentative correlate with imprecise magnitude, not an established driver. Neither missingness indicator showed a statistically detectable association with the outcome in this model; however, these results do not establish that the missingness mechanism is ignorable, and multiple imputation does not reproduce the finite-population design variance, so its inference is a sensitivity check. Attrition: model entrants (n = 187) vs excluded (n = 126) were similar on the outcome (66.8% vs 68.3% with no reported diagnosis) and differed mainly in age (mean 65.2 vs 61.6 years).</w:t>
+        <w:t xml:space="preserve">The income estimate is above 1 in every specification (1.34–1.48) — the direction is stable but precision depends on missing-data handling, so higher income is a tentative correlate, not an established driver. These results do not establish that the missingness mechanism is ignorable. Attrition: entrants (n = 187) vs excluded (n = 126) were similar on the outcome (66.8% vs 68.3%) and differed mainly in age (65.2 vs 61.6 years).</w:t>
       </w:r>
     </w:p>
     <w:p>
@@ -10515,19 +10381,7 @@
         <w:rPr>
           <w:rFonts w:ascii="Arial" w:eastAsia="Microsoft YaHei"/>
         </w:rPr>
-        <w:t xml:space="preserve"> Missingness among responders: education 32.6%, income 9.6%; all other imputation variables (outcome, age, sex, race, insurance, severity, cycle) had 0% missing. The income aOR was above 1 in each of the 20 imputations (pooled 1.388, per-imputation range 1.24–1.49, between-imputation SD 0.048; age 1.00, sex 0.99, education 0.76, race 1.39 pooled; ranges in </w:t>
-      </w:r>
-      <w:r>
-        <w:rPr>
-          <w:rFonts w:ascii="Consolas" w:cs="Consolas" w:eastAsia="Consolas" w:hAnsi="Consolas"/>
-        </w:rPr>
-        <w:t xml:space="preserve">numbers_v7.csv</w:t>
-      </w:r>
-      <w:r>
-        <w:rPr>
-          <w:rFonts w:ascii="Arial" w:eastAsia="Microsoft YaHei"/>
-        </w:rPr>
-        <w:t xml:space="preserve">, keys </w:t>
+        <w:t xml:space="preserve"> Missingness: education 32.6%, income 9.6%; all other imputation variables 0%. The income aOR was above 1 in each of the 20 imputations (pooled 1.388, range 1.24–1.49, SD 0.048; keys </w:t>
       </w:r>
       <w:r>
         <w:rPr>
@@ -10539,7 +10393,7 @@
         <w:rPr>
           <w:rFonts w:ascii="Arial" w:eastAsia="Microsoft YaHei"/>
         </w:rPr>
-        <w:t xml:space="preserve">). These 20 values are </w:t>
+        <w:t xml:space="preserve">). These are </w:t>
       </w:r>
       <w:r>
         <w:rPr>
@@ -10553,7 +10407,7 @@
         <w:rPr>
           <w:rFonts w:ascii="Arial" w:eastAsia="Microsoft YaHei"/>
         </w:rPr>
-        <w:t xml:space="preserve"> — they share the same observed data and the same imputation model and assumptions, so the tight range reflects within-imputation variability under one set of MAR-style assumptions rather than external confirmation of the income estimate. Conventional convergence diagnostics (trace plots, potential-scale-reduction, fraction-of-missing-information) were not generated for this single-model pooled analysis; the per-imputation spread reported here is therefore a limited stability check only, and the pooled inference remains a sensitivity analysis (multiple imputation does not reproduce the finite-population survey-design variance).</w:t>
+        <w:t xml:space="preserve"> — they share the same data and assumptions — and convergence diagnostics were not generated, so this is a limited stability check only; multiple imputation does not reproduce the survey-design variance.</w:t>
       </w:r>
     </w:p>
     <w:p>
@@ -10573,7 +10427,7 @@
         <w:rPr>
           <w:rFonts w:ascii="Arial" w:eastAsia="Microsoft YaHei"/>
         </w:rPr>
-        <w:t xml:space="preserve"> Logistic models of whether education (resp. income) is missing on age, sex, race, diabetes, insurance, the outcome and cycle. Education-missingness was associated with younger age (OR 0.94/yr, P &lt; 0.001) and insurance status (P &lt; 0.001) but </w:t>
+        <w:t xml:space="preserve"> Education-missingness was associated with younger age (OR 0.94/yr) and insurance (both P &lt; 0.001) but </w:t>
       </w:r>
       <w:r>
         <w:rPr>
@@ -10587,7 +10441,7 @@
         <w:rPr>
           <w:rFonts w:ascii="Arial" w:eastAsia="Microsoft YaHei"/>
         </w:rPr>
-        <w:t xml:space="preserve"> with the outcome (OR 0.995, P = 0.99). Income-missingness was associated with race/ethnicity (non-White OR 4.11, P = 0.011) but </w:t>
+        <w:t xml:space="preserve"> with the outcome (OR 0.995, P = 0.99); income-missingness with race/ethnicity (non-White OR 4.11, P = 0.011) but </w:t>
       </w:r>
       <w:r>
         <w:rPr>
@@ -10601,43 +10455,7 @@
         <w:rPr>
           <w:rFonts w:ascii="Arial" w:eastAsia="Microsoft YaHei"/>
         </w:rPr>
-        <w:t xml:space="preserve"> with the outcome (OR 1.21, P = 0.73). Missingness was thus associated with several observed participant characteristics, supporting their inclusion in the imputation and sensitivity analyses; neither missingness model identified a statistically detectable association with the diagnosis-discordance outcome. </w:t>
-      </w:r>
-      <w:r>
-        <w:rPr>
-          <w:rFonts w:ascii="Arial" w:eastAsia="Microsoft YaHei"/>
-          <w:b/>
-          <w:bCs/>
-        </w:rPr>
-        <w:t xml:space="preserve">However, these findings do not establish a missing-at-random mechanism and cannot exclude bias due to unobserved factors</w:t>
-      </w:r>
-      <w:r>
-        <w:rPr>
-          <w:rFonts w:ascii="Arial" w:eastAsia="Microsoft YaHei"/>
-        </w:rPr>
-        <w:t xml:space="preserve"> — the absence of a detectable outcome association in models of this size is not evidence that MAR holds. A further reduced model dropping </w:t>
-      </w:r>
-      <w:r>
-        <w:rPr>
-          <w:rFonts w:ascii="Arial" w:eastAsia="Microsoft YaHei"/>
-          <w:b/>
-          <w:bCs/>
-        </w:rPr>
-        <w:t xml:space="preserve">both</w:t>
-      </w:r>
-      <w:r>
-        <w:rPr>
-          <w:rFonts w:ascii="Arial" w:eastAsia="Microsoft YaHei"/>
-        </w:rPr>
-        <w:t xml:space="preserve"> education and income (retaining all 313 responders) left only age, sex and race, none associated with the outcome (age aOR 0.99, sex 1.11, race 1.05; all P &gt; 0.5). This reduced model was fitted only to describe associations with the remaining demographic covariates in the full responder sample; </w:t>
-      </w:r>
-      <w:r>
-        <w:rPr>
-          <w:rFonts w:ascii="Arial" w:eastAsia="Microsoft YaHei"/>
-          <w:b/>
-          <w:bCs/>
-        </w:rPr>
-        <w:t xml:space="preserve">because it excludes income, it does not test — and is not interpreted as evidence for — the consistency of the income association reported above.</w:t>
+        <w:t xml:space="preserve"> with the outcome (OR 1.21, P = 0.73). These do not establish a missing-at-random mechanism and cannot exclude unobserved bias. A reduced model dropping both education and income (n = 313) left age, sex and race, none associated with the outcome (all P &gt; 0.5); because it excludes income it does not test the consistency of the income association above.</w:t>
       </w:r>
     </w:p>
     <w:p>
@@ -11170,7 +10988,7 @@
           <w:i/>
           <w:iCs/>
         </w:rPr>
-        <w:t xml:space="preserve">Denominator trace for the 1.27% diabetic-eye figure: NHIS 2016 asks the "ever told by a doctor that diabetes affected the eyes" item (VIM_DREV) of ALL Sample Adult respondents without a diabetes branch screener, in contrast to NHANES DIQ080, which is asked only of participants who first report diabetes. The 1.27% weighted prevalence is therefore a whole-adult ≥40 self-reported prevalence (unweighted denominator n = 22,330), not a rate restricted to NHIS diabetics. A diabetes-restricted analogue (weighted 8.18% among NHIS 40+ adults with diagnosed diabetes) is documented in `results/sr_nhis_dr_denom_trace_v10.csv` and is not interchangeable with the value shown here.</w:t>
+        <w:t xml:space="preserve">Denominator trace for the 1.27% figure: NHIS asks the eye item (VIM_DREV) of ALL Sample Adults without a diabetes branch screener, unlike NHANES DIQ080 (asked only of those reporting diabetes), so 1.27% is a whole ≥40 self-reported prevalence (n = 22,330), not a rate among NHIS diabetics. A diabetes-restricted analogue (8.18%) is in `results/sr_nhis_dr_denom_trace_v10.csv`.</w:t>
       </w:r>
     </w:p>
     <w:p>
@@ -11848,23 +11666,7 @@
           <w:i/>
           <w:iCs/>
         </w:rPr>
-        <w:t xml:space="preserve">Standard weights are the survey-weighted NHANES 2005–2008 distribution of adults ≥40 across the five bands. The 80+ band is age ≥80; because NHANES top-codes age at 85, this band contains ages 80–84 plus the 85+ top-coded group. The standardised estimate is a weighted mean of band-specific rates, Σ(rate_b·w_b)/Σ(w_b). Its confidence interval is obtained from the </w:t>
-      </w:r>
-      <w:r>
-        <w:rPr>
-          <w:rFonts w:ascii="Arial" w:eastAsia="Microsoft YaHei"/>
-          <w:i/>
-          <w:iCs/>
-        </w:rPr>
-        <w:t xml:space="preserve">full design-based covariance between the age-band estimates</w:t>
-      </w:r>
-      <w:r>
-        <w:rPr>
-          <w:rFonts w:ascii="Arial" w:eastAsia="Microsoft YaHei"/>
-          <w:i/>
-          <w:iCs/>
-        </w:rPr>
-        <w:t xml:space="preserve"> (panel c) rather than treating bands as independent strata; this widens the interval slightly (from 2.23–2.68 under the independence assumption to 2.22–2.69). The age-standardised NHIS proportion (2.45%) is lower than the crude (2.66%) because the NHANES 40+ population is somewhat younger than NHIS's; the objectively graded AMD prevalence (6.58%) exceeds both.</w:t>
+        <w:t xml:space="preserve">Standard weights are the survey-weighted NHANES 40+ distribution across the five bands (80+ includes the 85+ top-coded group). The standardised CI uses the full design covariance between bands, widening it slightly (2.23–2.68 → 2.22–2.69).</w:t>
       </w:r>
     </w:p>
     <w:p>
@@ -12328,23 +12130,7 @@
           <w:i/>
           <w:iCs/>
         </w:rPr>
-        <w:t xml:space="preserve">Direct standardisation was implemented through a reweighting identity: each NHIS respondent's weight was rescaled by the ratio of the target (NHANES) band or cell share to the realised weighted respondent total in that band/cell, so that a single design-based `svymean` reproduces the standardised rate and carries the covariance between domains automatically. The standard-population weights are treated as fixed, so each interval is </w:t>
-      </w:r>
-      <w:r>
-        <w:rPr>
-          <w:rFonts w:ascii="Arial" w:eastAsia="Microsoft YaHei"/>
-          <w:i/>
-          <w:iCs/>
-        </w:rPr>
-        <w:t xml:space="preserve">conditional on the chosen NHANES-derived weights</w:t>
-      </w:r>
-      <w:r>
-        <w:rPr>
-          <w:rFonts w:ascii="Arial" w:eastAsia="Microsoft YaHei"/>
-          <w:i/>
-          <w:iCs/>
-        </w:rPr>
-        <w:t xml:space="preserve">; we did not additionally propagate the sampling uncertainty of the standard weights themselves. The age-and-sex result (2.46%) is essentially identical to age-only (2.45%), so sex composition does not materially affect the benchmark. Because NHANES (2005–2008 imaging) and NHIS (2016 self-report) differ in year and instrument, the gap between 6.58% and ~2.45% cannot be attributed solely to under-diagnosis.</w:t>
+        <w:t xml:space="preserve">Standard weights are fixed, so each interval is conditional on them. Age-and-sex (2.46%) ≈ age-only (2.45%). Because NHANES (2005–2008 imaging) and NHIS (2016 self-report) differ in year and instrument, the 6.58%-vs-2.45% gap cannot be attributed solely to under-diagnosis.</w:t>
       </w:r>
     </w:p>
     <w:p>
@@ -12629,13 +12415,7 @@
           <w:i/>
           <w:iCs/>
         </w:rPr>
-        <w:t xml:space="preserve">Note on construct mismatch:</w:t>
-      </w:r>
-      <w:r>
-        <w:rPr>
-          <w:rFonts w:ascii="Arial" w:eastAsia="Microsoft YaHei"/>
-        </w:rPr>
-        <w:t xml:space="preserve"> the NHIS cataract item records whether a person was </w:t>
+        <w:t xml:space="preserve">Construct mismatch: the NHIS item is "ever told you have cataract" while the NHANES figure (Supplementary Table S5d) is cataract-</w:t>
       </w:r>
       <w:r>
         <w:rPr>
@@ -12643,13 +12423,7 @@
           <w:i/>
           <w:iCs/>
         </w:rPr>
-        <w:t xml:space="preserve">ever told they had cataract</w:t>
-      </w:r>
-      <w:r>
-        <w:rPr>
-          <w:rFonts w:ascii="Arial" w:eastAsia="Microsoft YaHei"/>
-        </w:rPr>
-        <w:t xml:space="preserve">, whereas the NHANES cataract figure (Supplementary Table S5d) is </w:t>
+        <w:t xml:space="preserve">surgery</w:t>
       </w:r>
       <w:r>
         <w:rPr>
@@ -12657,25 +12431,7 @@
           <w:i/>
           <w:iCs/>
         </w:rPr>
-        <w:t xml:space="preserve">cataract-surgery history</w:t>
-      </w:r>
-      <w:r>
-        <w:rPr>
-          <w:rFonts w:ascii="Arial" w:eastAsia="Microsoft YaHei"/>
-        </w:rPr>
-        <w:t xml:space="preserve"> (</w:t>
-      </w:r>
-      <w:r>
-        <w:rPr>
-          <w:rFonts w:ascii="Consolas" w:cs="Consolas" w:eastAsia="Consolas" w:hAnsi="Consolas"/>
-        </w:rPr>
-        <w:t xml:space="preserve">VIQ071</w:t>
-      </w:r>
-      <w:r>
-        <w:rPr>
-          <w:rFonts w:ascii="Arial" w:eastAsia="Microsoft YaHei"/>
-        </w:rPr>
-        <w:t xml:space="preserve">). These are different endpoints and are deliberately not placed side by side. No NHANES glaucoma-imaging analogue exists (glaucoma is not graded in the retinal photographs), so NHIS glaucoma is presented here without an objective comparator.</w:t>
+        <w:t xml:space="preserve"> history — different endpoints, not compared. NHIS glaucoma has no NHANES imaging analogue.</w:t>
       </w:r>
     </w:p>
     <w:p>
@@ -13793,7 +13549,7 @@
           <w:i/>
           <w:iCs/>
         </w:rPr>
-        <w:t xml:space="preserve">The AMD dilated-exam item is missing for 377/436 because `DIQ360` is asked only of people with diabetes; only 59 AMD responders were diabetic, which is why the eye-care–awareness analysis cannot be run for AMD.</w:t>
+        <w:t xml:space="preserve">The AMD dilated-exam item is missing for 377/436 because `DIQ360` is asked only of people with diabetes; only 59 AMD responders were diabetic, so the eye-care–awareness analysis cannot be run for AMD.</w:t>
       </w:r>
     </w:p>
     <w:p>
@@ -14548,7 +14304,7 @@
           <w:i/>
           <w:iCs/>
         </w:rPr>
-        <w:t xml:space="preserve">The reduction from 313 (436) to the core model 187 (226) is driven by missing education and income. The single fitted missing-indicator model retains </w:t>
+        <w:t xml:space="preserve">The reduction from 313 (436) to the core 187 (226) is driven by missing education and income. The missing-indicator model retains all 313 responders and is a stability check, not evidence that missingness is ignorable; it is distinct from the education-complete count of 211, which is descriptive only. </w:t>
       </w:r>
       <w:r>
         <w:rPr>
@@ -14556,7 +14312,7 @@
           <w:i/>
           <w:iCs/>
         </w:rPr>
-        <w:t xml:space="preserve">all 313</w:t>
+        <w:t xml:space="preserve">AMD insurance (moved here because it is not a fitted term):</w:t>
       </w:r>
       <w:r>
         <w:rPr>
@@ -14564,23 +14320,7 @@
           <w:i/>
           <w:iCs/>
         </w:rPr>
-        <w:t xml:space="preserve"> responders by median-filling income and adding missingness indicators for both income and education; it is therefore distinct from the education-complete count of 211, which is reported only to explain attrition and is not itself a model. Because a missing-indicator approach cannot exclude informative (MNAR) missingness, it is used as a stability check, not as evidence that missingness is ignorable. </w:t>
-      </w:r>
-      <w:r>
-        <w:rPr>
-          <w:rFonts w:ascii="Arial" w:eastAsia="Microsoft YaHei"/>
-          <w:i/>
-          <w:iCs/>
-        </w:rPr>
-        <w:t xml:space="preserve">AMD insurance descriptive (moved here from the main-text model table because it is not a fitted term):</w:t>
-      </w:r>
-      <w:r>
-        <w:rPr>
-          <w:rFonts w:ascii="Arial" w:eastAsia="Microsoft YaHei"/>
-          <w:i/>
-          <w:iCs/>
-        </w:rPr>
-        <w:t xml:space="preserve"> among the 225 AMD responders with a known coverage status — a subset of the 226 core cases in which insurance was recorded, not all 436 AMD responders — 177 of 211 insured (83.9%) and all 14 of 14 uninsured reported no prior diagnosis. Because the uninsured stratum was perfectly separated from the outcome, an insured-versus-uninsured odds ratio is not estimable in a conventional logistic model for AMD; the AMD model therefore excludes insurance, and this table records the raw descriptive contrast only.</w:t>
+        <w:t xml:space="preserve"> among the 225 AMD responders with known coverage, 177/211 insured (83.9%) and 14/14 uninsured reported no prior diagnosis; the uninsured stratum perfectly separated from the outcome, so an insured-vs-uninsured OR is not estimable and AMD excludes insurance.</w:t>
       </w:r>
     </w:p>
     <w:p>
@@ -14600,7 +14340,7 @@
         <w:rPr>
           <w:rFonts w:ascii="Arial" w:eastAsia="Microsoft YaHei"/>
         </w:rPr>
-        <w:t xml:space="preserve"> These whole-population descriptives are reported for completeness and are </w:t>
+        <w:t xml:space="preserve"> These are </w:t>
       </w:r>
       <w:r>
         <w:rPr>
@@ -14614,7 +14354,7 @@
         <w:rPr>
           <w:rFonts w:ascii="Arial" w:eastAsia="Microsoft YaHei"/>
         </w:rPr>
-        <w:t xml:space="preserve"> part of the objective-versus-reported comparison; they should not be read alongside the imaging outcomes in main-text Table 1.</w:t>
+        <w:t xml:space="preserve"> part of the objective-versus-reported comparison.</w:t>
       </w:r>
     </w:p>
     <w:tbl>
@@ -14962,7 +14702,7 @@
           <w:i/>
           <w:iCs/>
         </w:rPr>
-        <w:t xml:space="preserve">Note the construct: NHANES records cataract-</w:t>
+        <w:t xml:space="preserve">Construct: NHANES records cataract-</w:t>
       </w:r>
       <w:r>
         <w:rPr>
@@ -14978,7 +14718,7 @@
           <w:i/>
           <w:iCs/>
         </w:rPr>
-        <w:t xml:space="preserve"> history (`VIQ071`), which is different from the NHIS "ever told you had cataract" item reported in Supplementary Table S4(d); the two are deliberately not compared.</w:t>
+        <w:t xml:space="preserve"> history (`VIQ071`), unlike the NHIS "ever told you had cataract" item in Supplementary Table S4(d); the two are not compared.</w:t>
       </w:r>
     </w:p>
     <w:p>
@@ -15337,7 +15077,7 @@
           <w:i/>
           <w:iCs/>
         </w:rPr>
-        <w:t xml:space="preserve">Bounds were recomputed with the full survey weights (not by adding/subtracting people from a percentage): non-responders were assigned y = 0 (all diagnosed) then y = 1 (all undiagnosed) and the weighted logit proportion re-estimated. The primary responders-only estimate lies within the bounds and the bound width is ~1–1.4 percentage points, so the headline gaps are not driven by the few diagnosis-item non-responders.</w:t>
+        <w:t xml:space="preserve">Bounds were recomputed with the full survey weights (non-responders set to all-diagnosed then all-undiagnosed), not by count arithmetic. The primary estimate lies within the ~1–1.4-point bounds, so the headline gaps are not driven by the few non-responders.</w:t>
       </w:r>
     </w:p>
     <w:p>
@@ -17487,7 +17227,7 @@
           <w:i/>
           <w:iCs/>
         </w:rPr>
-        <w:t xml:space="preserve">The severity responder counts (560/197/85/31 = 873) are the diabetes-restricted gradable participants who answered `DIQ080`; the retinopathy subset (197+85+31 = 313) equals the primary DR gap denominator. Severity is a grading category, not a treatment indication. Early and late AMD gaps are computed directly from their own responder sets (381 and 55), not by subtracting one percentage from another. Because the late-AMD and high-severity strata are small, they are reported as design-weighted proportions with confidence intervals, without additional multivariable modelling; the geographic-atrophy vs neovascular difference has wide, overlapping intervals and is not an established group difference. The subtype counts are mutually exclusive rather than double-counted: NHANES records the two late-AMD phenotypes as separate flags (`OPDUGA`, `OPDUEXU`), the worse-eye summary assigns each participant to a single late-AMD category, and no participant was flagged with both phenotypes in the same worse eye (0 of 55), so 32 + 23 = 55 reproduces the late-AMD total exactly. A single worse eye can carry only one graded phenotype, so a bilateral-mixed pattern (geographic atrophy in one eye, neovascular disease in the other) could in principle be undercounted; the counts are best read as an approximately mutually exclusive partition rather than clinically exhaustive phenotyping.</w:t>
+        <w:t xml:space="preserve">The severity counts (560/197/85/31 = 873) are diabetes-restricted gradable responders who answered `DIQ080`; the retinopathy subset (197+85+31 = 313) equals the primary DR denominator. Early/late AMD gaps use their own responder sets (381, 55), not percentage subtraction. Late-AMD and high-severity strata are small and reported as design-weighted proportions only; the geographic-atrophy vs neovascular difference has wide, overlapping intervals and is not an established group difference. The two late-AMD phenotypes are separate flags (`OPDUGA`, `OPDUEXU`) and no worse eye carried both (0 of 55), so 32 + 23 = 55 reproduces the late total; a bilateral-mixed pattern could be undercounted, so read these as an approximately mutually exclusive partition.</w:t>
       </w:r>
     </w:p>
     <w:p>
@@ -18168,7 +17908,7 @@
           <w:i/>
           <w:iCs/>
         </w:rPr>
-        <w:t xml:space="preserve">Ungradable-image participants were older, more often diabetic and less often high-school-educated, a plausible signal that images failed more often in higher-risk eyes.</w:t>
+        <w:t xml:space="preserve">Ungradable-image participants were older, more often diabetic and less often high-school-educated.</w:t>
       </w:r>
     </w:p>
     <w:p>
@@ -18528,7 +18268,7 @@
         <w:rPr>
           <w:rFonts w:ascii="Arial" w:eastAsia="Microsoft YaHei"/>
         </w:rPr>
-        <w:t xml:space="preserve">The weight diagnostics below separate the three distinct quantities that were previously conflated under a single "Weight" label. The very large values are the </w:t>
+        <w:t xml:space="preserve">The large values below are the </w:t>
       </w:r>
       <w:r>
         <w:rPr>
@@ -18542,21 +18282,7 @@
         <w:rPr>
           <w:rFonts w:ascii="Arial" w:eastAsia="Microsoft YaHei"/>
         </w:rPr>
-        <w:t xml:space="preserve"> (baseline MEC weight × inverse-probability factor), </w:t>
-      </w:r>
-      <w:r>
-        <w:rPr>
-          <w:rFonts w:ascii="Arial" w:eastAsia="Microsoft YaHei"/>
-          <w:b/>
-          <w:bCs/>
-        </w:rPr>
-        <w:t xml:space="preserve">not</w:t>
-      </w:r>
-      <w:r>
-        <w:rPr>
-          <w:rFonts w:ascii="Arial" w:eastAsia="Microsoft YaHei"/>
-        </w:rPr>
-        <w:t xml:space="preserve"> the inverse-probability factor itself, which is modest.</w:t>
+        <w:t xml:space="preserve"> (baseline MEC weight × inverse-probability factor), not the inverse-probability factor itself, which is modest.</w:t>
       </w:r>
     </w:p>
     <w:tbl>
@@ -19226,7 +18952,7 @@
           <w:i/>
           <w:iCs/>
         </w:rPr>
-        <w:t xml:space="preserve">Probabilities of a gradable image were modelled with a base specification (age, sex, race/ethnicity) and an extended specification adding diabetes, insurance and education; gradable respondents were reweighted by their inverse predicted probability, with a probability floor of 0.05 to bound extreme weights. Because the smallest predicted gradability probability was 0.637 (base) and 0.569 (extended), the 0.05 floor was </w:t>
+        <w:t xml:space="preserve">Gradability was modelled with base (age, sex, race) and extended (+ diabetes, insurance, education) specifications; respondents were reweighted by 1/P with a 0.05 floor. The smallest P was 0.637 (base) and 0.569 (extended), so the floor was </w:t>
       </w:r>
       <w:r>
         <w:rPr>
@@ -19242,21 +18968,7 @@
           <w:i/>
           <w:iCs/>
         </w:rPr>
-        <w:t xml:space="preserve"> — no observation was truncated — so the reported IPW estimates are unaffected by the truncation rule. The extended model, which adds education and insurance, could only be fitted on the 3,687 respondents with complete covariates (vs 6,797 for the base model); gradable respondents with missing extended covariates were assigned P = 1 (no up-weighting), so the extended model reweights a subset and thus targets a slightly different effective population than the base model. The large numbers under "combined survey weight" are the baseline NHANES MEC weight multiplied by the 1/P factor and should not be read as the inverse-probability factor. ESS was computed as the Kish effective sample size, (Σw)²/Σw², over the combined weights of the 5,704 gradable respondents.</w:t>
-      </w:r>
-    </w:p>
-    <w:p>
-      <w:pPr>
-        <w:spacing w:after="120" w:line="360" w:lineRule="auto"/>
-        <w:ind w:firstLine="480"/>
-      </w:pPr>
-      <w:r>
-        <w:rPr>
-          <w:rFonts w:ascii="Arial" w:eastAsia="Microsoft YaHei"/>
-          <w:i/>
-          <w:iCs/>
-        </w:rPr>
-        <w:t xml:space="preserve">Across both specifications IPW prevalence moved from the naive value by ≤0.6 percentage points, indicating that observable gradable-vs-ungradable differences do not materially bias the descriptive prevalence. The combined-weight ESS (≈3,635–3,656) is close to the raw-weight ESS (≈3,508), which suggests the reweighting did not concentrate the sample into a small handful of observations. </w:t>
+        <w:t xml:space="preserve">. The extended model fitted only 3,687 complete-covariate respondents (vs 6,797), so it targets a slightly different effective population. IPW moved prevalence by ≤0.6 points; combined-weight ESS ≈ raw-weight ESS is a </w:t>
       </w:r>
       <w:r>
         <w:rPr>
@@ -19264,7 +18976,7 @@
           <w:i/>
           <w:iCs/>
         </w:rPr>
-        <w:t xml:space="preserve">This closeness is a limited stability check only, not proof of weight stability</w:t>
+        <w:t xml:space="preserve">limited stability check only</w:t>
       </w:r>
       <w:r>
         <w:rPr>
@@ -19272,7 +18984,7 @@
           <w:i/>
           <w:iCs/>
         </w:rPr>
-        <w:t xml:space="preserve">: a near-unchanged aggregate ESS can coexist with a long weight tail, and it says nothing about selection on unobserved factors. IPW corrects only for observable differences; unobservable sources of grading selection remain possible.</w:t>
+        <w:t xml:space="preserve">. IPW corrects for observable differences; unobserved grading selection remains possible.</w:t>
       </w:r>
     </w:p>
     <w:p>
@@ -19557,7 +19269,7 @@
           <w:i/>
           <w:iCs/>
         </w:rPr>
-        <w:t xml:space="preserve">Because prevalence-level IPW does not by itself demonstrate that the discordance proportions are unaffected by grading feasibility, we reweighted the DR and AMD responder sets directly by 1/P(gradable) and re-estimated the diagnosis gap. Both gaps were essentially unchanged (DR 70.2→70.2; AMD 82.2→82.0), indicating the headline discordance estimates move little under observable grading-feasibility reweighting; this still cannot exclude unmeasured selection among people whose images could not be graded.</w:t>
+        <w:t xml:space="preserve">Reweighting the DR and AMD responder sets by 1/P(gradable) barely changed the gaps (DR 70.2→70.2; AMD 82.2→82.0); this still cannot exclude unmeasured selection among ungradable participants.</w:t>
       </w:r>
     </w:p>
     <w:p>
@@ -19580,7 +19292,7 @@
         <w:rPr>
           <w:rFonts w:ascii="Arial" w:eastAsia="Microsoft YaHei"/>
         </w:rPr>
-        <w:t xml:space="preserve">The AMD diagnosis gap falls steeply with age (from ~99% in the youngest band to ~67% in the oldest). Because older participants also carry more late AMD, we tested whether the age gradient is simply a proxy for severity, using two complementary approaches (both at the model residual df from the same fitted objects as Table S2b).</w:t>
+        <w:t xml:space="preserve">The AMD diagnosis gap falls steeply with age (from ~99% in the youngest band to ~67% in the oldest). Because older participants also carry more late AMD, we tested whether the gradient is a proxy for severity (both at the residual df of the same objects as Table S2b).</w:t>
       </w:r>
     </w:p>
     <w:p>
@@ -20044,7 +19756,7 @@
           <w:i/>
           <w:iCs/>
         </w:rPr>
-        <w:t xml:space="preserve">n = 436 AMD responders with a gradable stage; design df = 30, model rank = 4, residual df = 27, CI multiplier t(0.975, 27) = 2.052. Both age and stage retain strong, mutually independent effects: adjusting for severity barely changes the age term (0.93/yr unadjusted → 0.92/yr adjusted), and late stage is independently associated with a much lower gap.</w:t>
+        <w:t xml:space="preserve">n = 436 AMD responders with a gradable stage; design df = 30, rank = 4, residual df = 27, t(0.975, 27) = 2.052. Adjusting for severity barely changes the age term (0.93 → 0.92/yr), and late stage is independently associated with a much lower gap.</w:t>
       </w:r>
     </w:p>
     <w:p>
@@ -20406,21 +20118,7 @@
           <w:i/>
           <w:iCs/>
         </w:rPr>
-        <w:t xml:space="preserve">Restricted to participants graded as early AMD, so the severity mix is approximately fixed across the age bands. The gap still falls monotonically with age (99.1% → 92.4% → 78.4%), i.e. even among people with the same (early) disease stage, older participants more often reported a prior diagnosis.</w:t>
-      </w:r>
-    </w:p>
-    <w:p>
-      <w:pPr>
-        <w:spacing w:after="120" w:line="360" w:lineRule="auto"/>
-        <w:ind w:firstLine="480"/>
-      </w:pPr>
-      <w:r>
-        <w:rPr>
-          <w:rFonts w:ascii="Arial" w:eastAsia="Microsoft YaHei"/>
-          <w:i/>
-          <w:iCs/>
-        </w:rPr>
-        <w:t xml:space="preserve">Together these show that the AMD age gradient is not an artefact of older people being more severely affected: it persists after adjusting for stage (a) and within a stage-restricted early-AMD sample (b). This is consistent with greater cumulative ophthalmic contact / diagnosis opportunity with advancing age, but the cross-sectional design cannot establish that ageing itself causes higher awareness.</w:t>
+        <w:t xml:space="preserve">Within early AMD the gap still falls with age (99.1% → 92.4% → 78.4%). Together with (a) this shows the age gradient is not an artefact of older people being more severely affected; it is consistent with greater cumulative eye-care contact with age, but the cross-sectional design cannot establish that ageing causes higher awareness.</w:t>
       </w:r>
     </w:p>
     <w:sectPr>

</xml_diff>

<commit_message>
v10.0.0 (round-15): 5cm x 5cm Nature figures, figures/tables moved to end of main ms, three-line (booktabs) tables in main+supplement, PubMed-verified refs, Discussion polish; verify 239/47/12.
</commit_message>
<xml_diff>
--- a/manuscript/Supplementary_Materials_v7.docx
+++ b/manuscript/Supplementary_Materials_v7.docx
@@ -259,12 +259,12 @@
       <w:tblPr>
         <w:tblW w:type="dxa" w:w="9026"/>
         <w:tblBorders>
-          <w:top w:val="single" w:color="auto" w:sz="4"/>
-          <w:left w:val="single" w:color="auto" w:sz="4"/>
-          <w:bottom w:val="single" w:color="auto" w:sz="4"/>
-          <w:right w:val="single" w:color="auto" w:sz="4"/>
-          <w:insideH w:val="single" w:color="auto" w:sz="4"/>
-          <w:insideV w:val="single" w:color="auto" w:sz="4"/>
+          <w:top w:val="single" w:color="auto" w:sz="12" w:space="0"/>
+          <w:left w:val="none" w:color="auto" w:sz="0" w:space="0"/>
+          <w:bottom w:val="single" w:color="auto" w:sz="12" w:space="0"/>
+          <w:right w:val="none" w:color="auto" w:sz="0" w:space="0"/>
+          <w:insideH w:val="none" w:color="auto" w:sz="0" w:space="0"/>
+          <w:insideV w:val="none" w:color="auto" w:sz="0" w:space="0"/>
         </w:tblBorders>
       </w:tblPr>
       <w:tblGrid>
@@ -280,10 +280,7 @@
           <w:tcPr>
             <w:tcW w:type="dxa" w:w="1504"/>
             <w:tcBorders>
-              <w:top w:val="single" w:color="CCCCCC" w:sz="1"/>
-              <w:left w:val="single" w:color="CCCCCC" w:sz="1"/>
-              <w:bottom w:val="single" w:color="CCCCCC" w:sz="1"/>
-              <w:right w:val="single" w:color="CCCCCC" w:sz="1"/>
+              <w:bottom w:val="single" w:sz="6" w:space="0" w:color="auto"/>
             </w:tcBorders>
             <w:shd w:fill="D5E8F0" w:val="clear"/>
             <w:tcMar>
@@ -306,10 +303,7 @@
           <w:tcPr>
             <w:tcW w:type="dxa" w:w="1504"/>
             <w:tcBorders>
-              <w:top w:val="single" w:color="CCCCCC" w:sz="1"/>
-              <w:left w:val="single" w:color="CCCCCC" w:sz="1"/>
-              <w:bottom w:val="single" w:color="CCCCCC" w:sz="1"/>
-              <w:right w:val="single" w:color="CCCCCC" w:sz="1"/>
+              <w:bottom w:val="single" w:sz="6" w:space="0" w:color="auto"/>
             </w:tcBorders>
             <w:shd w:fill="D5E8F0" w:val="clear"/>
             <w:tcMar>
@@ -332,10 +326,7 @@
           <w:tcPr>
             <w:tcW w:type="dxa" w:w="1504"/>
             <w:tcBorders>
-              <w:top w:val="single" w:color="CCCCCC" w:sz="1"/>
-              <w:left w:val="single" w:color="CCCCCC" w:sz="1"/>
-              <w:bottom w:val="single" w:color="CCCCCC" w:sz="1"/>
-              <w:right w:val="single" w:color="CCCCCC" w:sz="1"/>
+              <w:bottom w:val="single" w:sz="6" w:space="0" w:color="auto"/>
             </w:tcBorders>
             <w:shd w:fill="D5E8F0" w:val="clear"/>
             <w:tcMar>
@@ -358,10 +349,7 @@
           <w:tcPr>
             <w:tcW w:type="dxa" w:w="1504"/>
             <w:tcBorders>
-              <w:top w:val="single" w:color="CCCCCC" w:sz="1"/>
-              <w:left w:val="single" w:color="CCCCCC" w:sz="1"/>
-              <w:bottom w:val="single" w:color="CCCCCC" w:sz="1"/>
-              <w:right w:val="single" w:color="CCCCCC" w:sz="1"/>
+              <w:bottom w:val="single" w:sz="6" w:space="0" w:color="auto"/>
             </w:tcBorders>
             <w:shd w:fill="D5E8F0" w:val="clear"/>
             <w:tcMar>
@@ -384,10 +372,7 @@
           <w:tcPr>
             <w:tcW w:type="dxa" w:w="1504"/>
             <w:tcBorders>
-              <w:top w:val="single" w:color="CCCCCC" w:sz="1"/>
-              <w:left w:val="single" w:color="CCCCCC" w:sz="1"/>
-              <w:bottom w:val="single" w:color="CCCCCC" w:sz="1"/>
-              <w:right w:val="single" w:color="CCCCCC" w:sz="1"/>
+              <w:bottom w:val="single" w:sz="6" w:space="0" w:color="auto"/>
             </w:tcBorders>
             <w:shd w:fill="D5E8F0" w:val="clear"/>
             <w:tcMar>
@@ -410,10 +395,7 @@
           <w:tcPr>
             <w:tcW w:type="dxa" w:w="1504"/>
             <w:tcBorders>
-              <w:top w:val="single" w:color="CCCCCC" w:sz="1"/>
-              <w:left w:val="single" w:color="CCCCCC" w:sz="1"/>
-              <w:bottom w:val="single" w:color="CCCCCC" w:sz="1"/>
-              <w:right w:val="single" w:color="CCCCCC" w:sz="1"/>
+              <w:bottom w:val="single" w:sz="6" w:space="0" w:color="auto"/>
             </w:tcBorders>
             <w:shd w:fill="D5E8F0" w:val="clear"/>
             <w:tcMar>
@@ -2812,12 +2794,12 @@
       <w:tblPr>
         <w:tblW w:type="dxa" w:w="9026"/>
         <w:tblBorders>
-          <w:top w:val="single" w:color="auto" w:sz="4"/>
-          <w:left w:val="single" w:color="auto" w:sz="4"/>
-          <w:bottom w:val="single" w:color="auto" w:sz="4"/>
-          <w:right w:val="single" w:color="auto" w:sz="4"/>
-          <w:insideH w:val="single" w:color="auto" w:sz="4"/>
-          <w:insideV w:val="single" w:color="auto" w:sz="4"/>
+          <w:top w:val="single" w:color="auto" w:sz="12" w:space="0"/>
+          <w:left w:val="none" w:color="auto" w:sz="0" w:space="0"/>
+          <w:bottom w:val="single" w:color="auto" w:sz="12" w:space="0"/>
+          <w:right w:val="none" w:color="auto" w:sz="0" w:space="0"/>
+          <w:insideH w:val="none" w:color="auto" w:sz="0" w:space="0"/>
+          <w:insideV w:val="none" w:color="auto" w:sz="0" w:space="0"/>
         </w:tblBorders>
       </w:tblPr>
       <w:tblGrid>
@@ -2832,10 +2814,7 @@
           <w:tcPr>
             <w:tcW w:type="dxa" w:w="1805"/>
             <w:tcBorders>
-              <w:top w:val="single" w:color="CCCCCC" w:sz="1"/>
-              <w:left w:val="single" w:color="CCCCCC" w:sz="1"/>
-              <w:bottom w:val="single" w:color="CCCCCC" w:sz="1"/>
-              <w:right w:val="single" w:color="CCCCCC" w:sz="1"/>
+              <w:bottom w:val="single" w:sz="6" w:space="0" w:color="auto"/>
             </w:tcBorders>
             <w:shd w:fill="D5E8F0" w:val="clear"/>
             <w:tcMar>
@@ -2858,10 +2837,7 @@
           <w:tcPr>
             <w:tcW w:type="dxa" w:w="1805"/>
             <w:tcBorders>
-              <w:top w:val="single" w:color="CCCCCC" w:sz="1"/>
-              <w:left w:val="single" w:color="CCCCCC" w:sz="1"/>
-              <w:bottom w:val="single" w:color="CCCCCC" w:sz="1"/>
-              <w:right w:val="single" w:color="CCCCCC" w:sz="1"/>
+              <w:bottom w:val="single" w:sz="6" w:space="0" w:color="auto"/>
             </w:tcBorders>
             <w:shd w:fill="D5E8F0" w:val="clear"/>
             <w:tcMar>
@@ -2884,10 +2860,7 @@
           <w:tcPr>
             <w:tcW w:type="dxa" w:w="1805"/>
             <w:tcBorders>
-              <w:top w:val="single" w:color="CCCCCC" w:sz="1"/>
-              <w:left w:val="single" w:color="CCCCCC" w:sz="1"/>
-              <w:bottom w:val="single" w:color="CCCCCC" w:sz="1"/>
-              <w:right w:val="single" w:color="CCCCCC" w:sz="1"/>
+              <w:bottom w:val="single" w:sz="6" w:space="0" w:color="auto"/>
             </w:tcBorders>
             <w:shd w:fill="D5E8F0" w:val="clear"/>
             <w:tcMar>
@@ -2910,10 +2883,7 @@
           <w:tcPr>
             <w:tcW w:type="dxa" w:w="1805"/>
             <w:tcBorders>
-              <w:top w:val="single" w:color="CCCCCC" w:sz="1"/>
-              <w:left w:val="single" w:color="CCCCCC" w:sz="1"/>
-              <w:bottom w:val="single" w:color="CCCCCC" w:sz="1"/>
-              <w:right w:val="single" w:color="CCCCCC" w:sz="1"/>
+              <w:bottom w:val="single" w:sz="6" w:space="0" w:color="auto"/>
             </w:tcBorders>
             <w:shd w:fill="D5E8F0" w:val="clear"/>
             <w:tcMar>
@@ -2936,10 +2906,7 @@
           <w:tcPr>
             <w:tcW w:type="dxa" w:w="1805"/>
             <w:tcBorders>
-              <w:top w:val="single" w:color="CCCCCC" w:sz="1"/>
-              <w:left w:val="single" w:color="CCCCCC" w:sz="1"/>
-              <w:bottom w:val="single" w:color="CCCCCC" w:sz="1"/>
-              <w:right w:val="single" w:color="CCCCCC" w:sz="1"/>
+              <w:bottom w:val="single" w:sz="6" w:space="0" w:color="auto"/>
             </w:tcBorders>
             <w:shd w:fill="D5E8F0" w:val="clear"/>
             <w:tcMar>
@@ -3517,12 +3484,12 @@
       <w:tblPr>
         <w:tblW w:type="dxa" w:w="9026"/>
         <w:tblBorders>
-          <w:top w:val="single" w:color="auto" w:sz="4"/>
-          <w:left w:val="single" w:color="auto" w:sz="4"/>
-          <w:bottom w:val="single" w:color="auto" w:sz="4"/>
-          <w:right w:val="single" w:color="auto" w:sz="4"/>
-          <w:insideH w:val="single" w:color="auto" w:sz="4"/>
-          <w:insideV w:val="single" w:color="auto" w:sz="4"/>
+          <w:top w:val="single" w:color="auto" w:sz="12" w:space="0"/>
+          <w:left w:val="none" w:color="auto" w:sz="0" w:space="0"/>
+          <w:bottom w:val="single" w:color="auto" w:sz="12" w:space="0"/>
+          <w:right w:val="none" w:color="auto" w:sz="0" w:space="0"/>
+          <w:insideH w:val="none" w:color="auto" w:sz="0" w:space="0"/>
+          <w:insideV w:val="none" w:color="auto" w:sz="0" w:space="0"/>
         </w:tblBorders>
       </w:tblPr>
       <w:tblGrid>
@@ -3542,10 +3509,7 @@
           <w:tcPr>
             <w:tcW w:type="dxa" w:w="902"/>
             <w:tcBorders>
-              <w:top w:val="single" w:color="CCCCCC" w:sz="1"/>
-              <w:left w:val="single" w:color="CCCCCC" w:sz="1"/>
-              <w:bottom w:val="single" w:color="CCCCCC" w:sz="1"/>
-              <w:right w:val="single" w:color="CCCCCC" w:sz="1"/>
+              <w:bottom w:val="single" w:sz="6" w:space="0" w:color="auto"/>
             </w:tcBorders>
             <w:shd w:fill="D5E8F0" w:val="clear"/>
             <w:tcMar>
@@ -3568,10 +3532,7 @@
           <w:tcPr>
             <w:tcW w:type="dxa" w:w="902"/>
             <w:tcBorders>
-              <w:top w:val="single" w:color="CCCCCC" w:sz="1"/>
-              <w:left w:val="single" w:color="CCCCCC" w:sz="1"/>
-              <w:bottom w:val="single" w:color="CCCCCC" w:sz="1"/>
-              <w:right w:val="single" w:color="CCCCCC" w:sz="1"/>
+              <w:bottom w:val="single" w:sz="6" w:space="0" w:color="auto"/>
             </w:tcBorders>
             <w:shd w:fill="D5E8F0" w:val="clear"/>
             <w:tcMar>
@@ -3594,10 +3555,7 @@
           <w:tcPr>
             <w:tcW w:type="dxa" w:w="902"/>
             <w:tcBorders>
-              <w:top w:val="single" w:color="CCCCCC" w:sz="1"/>
-              <w:left w:val="single" w:color="CCCCCC" w:sz="1"/>
-              <w:bottom w:val="single" w:color="CCCCCC" w:sz="1"/>
-              <w:right w:val="single" w:color="CCCCCC" w:sz="1"/>
+              <w:bottom w:val="single" w:sz="6" w:space="0" w:color="auto"/>
             </w:tcBorders>
             <w:shd w:fill="D5E8F0" w:val="clear"/>
             <w:tcMar>
@@ -3632,10 +3590,7 @@
           <w:tcPr>
             <w:tcW w:type="dxa" w:w="902"/>
             <w:tcBorders>
-              <w:top w:val="single" w:color="CCCCCC" w:sz="1"/>
-              <w:left w:val="single" w:color="CCCCCC" w:sz="1"/>
-              <w:bottom w:val="single" w:color="CCCCCC" w:sz="1"/>
-              <w:right w:val="single" w:color="CCCCCC" w:sz="1"/>
+              <w:bottom w:val="single" w:sz="6" w:space="0" w:color="auto"/>
             </w:tcBorders>
             <w:shd w:fill="D5E8F0" w:val="clear"/>
             <w:tcMar>
@@ -3658,10 +3613,7 @@
           <w:tcPr>
             <w:tcW w:type="dxa" w:w="902"/>
             <w:tcBorders>
-              <w:top w:val="single" w:color="CCCCCC" w:sz="1"/>
-              <w:left w:val="single" w:color="CCCCCC" w:sz="1"/>
-              <w:bottom w:val="single" w:color="CCCCCC" w:sz="1"/>
-              <w:right w:val="single" w:color="CCCCCC" w:sz="1"/>
+              <w:bottom w:val="single" w:sz="6" w:space="0" w:color="auto"/>
             </w:tcBorders>
             <w:shd w:fill="D5E8F0" w:val="clear"/>
             <w:tcMar>
@@ -3684,10 +3636,7 @@
           <w:tcPr>
             <w:tcW w:type="dxa" w:w="902"/>
             <w:tcBorders>
-              <w:top w:val="single" w:color="CCCCCC" w:sz="1"/>
-              <w:left w:val="single" w:color="CCCCCC" w:sz="1"/>
-              <w:bottom w:val="single" w:color="CCCCCC" w:sz="1"/>
-              <w:right w:val="single" w:color="CCCCCC" w:sz="1"/>
+              <w:bottom w:val="single" w:sz="6" w:space="0" w:color="auto"/>
             </w:tcBorders>
             <w:shd w:fill="D5E8F0" w:val="clear"/>
             <w:tcMar>
@@ -3710,10 +3659,7 @@
           <w:tcPr>
             <w:tcW w:type="dxa" w:w="902"/>
             <w:tcBorders>
-              <w:top w:val="single" w:color="CCCCCC" w:sz="1"/>
-              <w:left w:val="single" w:color="CCCCCC" w:sz="1"/>
-              <w:bottom w:val="single" w:color="CCCCCC" w:sz="1"/>
-              <w:right w:val="single" w:color="CCCCCC" w:sz="1"/>
+              <w:bottom w:val="single" w:sz="6" w:space="0" w:color="auto"/>
             </w:tcBorders>
             <w:shd w:fill="D5E8F0" w:val="clear"/>
             <w:tcMar>
@@ -3736,10 +3682,7 @@
           <w:tcPr>
             <w:tcW w:type="dxa" w:w="902"/>
             <w:tcBorders>
-              <w:top w:val="single" w:color="CCCCCC" w:sz="1"/>
-              <w:left w:val="single" w:color="CCCCCC" w:sz="1"/>
-              <w:bottom w:val="single" w:color="CCCCCC" w:sz="1"/>
-              <w:right w:val="single" w:color="CCCCCC" w:sz="1"/>
+              <w:bottom w:val="single" w:sz="6" w:space="0" w:color="auto"/>
             </w:tcBorders>
             <w:shd w:fill="D5E8F0" w:val="clear"/>
             <w:tcMar>
@@ -3762,10 +3705,7 @@
           <w:tcPr>
             <w:tcW w:type="dxa" w:w="902"/>
             <w:tcBorders>
-              <w:top w:val="single" w:color="CCCCCC" w:sz="1"/>
-              <w:left w:val="single" w:color="CCCCCC" w:sz="1"/>
-              <w:bottom w:val="single" w:color="CCCCCC" w:sz="1"/>
-              <w:right w:val="single" w:color="CCCCCC" w:sz="1"/>
+              <w:bottom w:val="single" w:sz="6" w:space="0" w:color="auto"/>
             </w:tcBorders>
             <w:shd w:fill="D5E8F0" w:val="clear"/>
             <w:tcMar>
@@ -3788,10 +3728,7 @@
           <w:tcPr>
             <w:tcW w:type="dxa" w:w="902"/>
             <w:tcBorders>
-              <w:top w:val="single" w:color="CCCCCC" w:sz="1"/>
-              <w:left w:val="single" w:color="CCCCCC" w:sz="1"/>
-              <w:bottom w:val="single" w:color="CCCCCC" w:sz="1"/>
-              <w:right w:val="single" w:color="CCCCCC" w:sz="1"/>
+              <w:bottom w:val="single" w:sz="6" w:space="0" w:color="auto"/>
             </w:tcBorders>
             <w:shd w:fill="D5E8F0" w:val="clear"/>
             <w:tcMar>
@@ -8185,12 +8122,12 @@
       <w:tblPr>
         <w:tblW w:type="dxa" w:w="9026"/>
         <w:tblBorders>
-          <w:top w:val="single" w:color="auto" w:sz="4"/>
-          <w:left w:val="single" w:color="auto" w:sz="4"/>
-          <w:bottom w:val="single" w:color="auto" w:sz="4"/>
-          <w:right w:val="single" w:color="auto" w:sz="4"/>
-          <w:insideH w:val="single" w:color="auto" w:sz="4"/>
-          <w:insideV w:val="single" w:color="auto" w:sz="4"/>
+          <w:top w:val="single" w:color="auto" w:sz="12" w:space="0"/>
+          <w:left w:val="none" w:color="auto" w:sz="0" w:space="0"/>
+          <w:bottom w:val="single" w:color="auto" w:sz="12" w:space="0"/>
+          <w:right w:val="none" w:color="auto" w:sz="0" w:space="0"/>
+          <w:insideH w:val="none" w:color="auto" w:sz="0" w:space="0"/>
+          <w:insideV w:val="none" w:color="auto" w:sz="0" w:space="0"/>
         </w:tblBorders>
       </w:tblPr>
       <w:tblGrid>
@@ -8204,10 +8141,7 @@
           <w:tcPr>
             <w:tcW w:type="dxa" w:w="2256"/>
             <w:tcBorders>
-              <w:top w:val="single" w:color="CCCCCC" w:sz="1"/>
-              <w:left w:val="single" w:color="CCCCCC" w:sz="1"/>
-              <w:bottom w:val="single" w:color="CCCCCC" w:sz="1"/>
-              <w:right w:val="single" w:color="CCCCCC" w:sz="1"/>
+              <w:bottom w:val="single" w:sz="6" w:space="0" w:color="auto"/>
             </w:tcBorders>
             <w:shd w:fill="D5E8F0" w:val="clear"/>
             <w:tcMar>
@@ -8230,10 +8164,7 @@
           <w:tcPr>
             <w:tcW w:type="dxa" w:w="2256"/>
             <w:tcBorders>
-              <w:top w:val="single" w:color="CCCCCC" w:sz="1"/>
-              <w:left w:val="single" w:color="CCCCCC" w:sz="1"/>
-              <w:bottom w:val="single" w:color="CCCCCC" w:sz="1"/>
-              <w:right w:val="single" w:color="CCCCCC" w:sz="1"/>
+              <w:bottom w:val="single" w:sz="6" w:space="0" w:color="auto"/>
             </w:tcBorders>
             <w:shd w:fill="D5E8F0" w:val="clear"/>
             <w:tcMar>
@@ -8256,10 +8187,7 @@
           <w:tcPr>
             <w:tcW w:type="dxa" w:w="2256"/>
             <w:tcBorders>
-              <w:top w:val="single" w:color="CCCCCC" w:sz="1"/>
-              <w:left w:val="single" w:color="CCCCCC" w:sz="1"/>
-              <w:bottom w:val="single" w:color="CCCCCC" w:sz="1"/>
-              <w:right w:val="single" w:color="CCCCCC" w:sz="1"/>
+              <w:bottom w:val="single" w:sz="6" w:space="0" w:color="auto"/>
             </w:tcBorders>
             <w:shd w:fill="D5E8F0" w:val="clear"/>
             <w:tcMar>
@@ -8282,10 +8210,7 @@
           <w:tcPr>
             <w:tcW w:type="dxa" w:w="2256"/>
             <w:tcBorders>
-              <w:top w:val="single" w:color="CCCCCC" w:sz="1"/>
-              <w:left w:val="single" w:color="CCCCCC" w:sz="1"/>
-              <w:bottom w:val="single" w:color="CCCCCC" w:sz="1"/>
-              <w:right w:val="single" w:color="CCCCCC" w:sz="1"/>
+              <w:bottom w:val="single" w:sz="6" w:space="0" w:color="auto"/>
             </w:tcBorders>
             <w:shd w:fill="D5E8F0" w:val="clear"/>
             <w:tcMar>
@@ -9308,12 +9233,12 @@
       <w:tblPr>
         <w:tblW w:type="dxa" w:w="9026"/>
         <w:tblBorders>
-          <w:top w:val="single" w:color="auto" w:sz="4"/>
-          <w:left w:val="single" w:color="auto" w:sz="4"/>
-          <w:bottom w:val="single" w:color="auto" w:sz="4"/>
-          <w:right w:val="single" w:color="auto" w:sz="4"/>
-          <w:insideH w:val="single" w:color="auto" w:sz="4"/>
-          <w:insideV w:val="single" w:color="auto" w:sz="4"/>
+          <w:top w:val="single" w:color="auto" w:sz="12" w:space="0"/>
+          <w:left w:val="none" w:color="auto" w:sz="0" w:space="0"/>
+          <w:bottom w:val="single" w:color="auto" w:sz="12" w:space="0"/>
+          <w:right w:val="none" w:color="auto" w:sz="0" w:space="0"/>
+          <w:insideH w:val="none" w:color="auto" w:sz="0" w:space="0"/>
+          <w:insideV w:val="none" w:color="auto" w:sz="0" w:space="0"/>
         </w:tblBorders>
       </w:tblPr>
       <w:tblGrid>
@@ -9328,10 +9253,7 @@
           <w:tcPr>
             <w:tcW w:type="dxa" w:w="1805"/>
             <w:tcBorders>
-              <w:top w:val="single" w:color="CCCCCC" w:sz="1"/>
-              <w:left w:val="single" w:color="CCCCCC" w:sz="1"/>
-              <w:bottom w:val="single" w:color="CCCCCC" w:sz="1"/>
-              <w:right w:val="single" w:color="CCCCCC" w:sz="1"/>
+              <w:bottom w:val="single" w:sz="6" w:space="0" w:color="auto"/>
             </w:tcBorders>
             <w:shd w:fill="D5E8F0" w:val="clear"/>
             <w:tcMar>
@@ -9354,10 +9276,7 @@
           <w:tcPr>
             <w:tcW w:type="dxa" w:w="1805"/>
             <w:tcBorders>
-              <w:top w:val="single" w:color="CCCCCC" w:sz="1"/>
-              <w:left w:val="single" w:color="CCCCCC" w:sz="1"/>
-              <w:bottom w:val="single" w:color="CCCCCC" w:sz="1"/>
-              <w:right w:val="single" w:color="CCCCCC" w:sz="1"/>
+              <w:bottom w:val="single" w:sz="6" w:space="0" w:color="auto"/>
             </w:tcBorders>
             <w:shd w:fill="D5E8F0" w:val="clear"/>
             <w:tcMar>
@@ -9380,10 +9299,7 @@
           <w:tcPr>
             <w:tcW w:type="dxa" w:w="1805"/>
             <w:tcBorders>
-              <w:top w:val="single" w:color="CCCCCC" w:sz="1"/>
-              <w:left w:val="single" w:color="CCCCCC" w:sz="1"/>
-              <w:bottom w:val="single" w:color="CCCCCC" w:sz="1"/>
-              <w:right w:val="single" w:color="CCCCCC" w:sz="1"/>
+              <w:bottom w:val="single" w:sz="6" w:space="0" w:color="auto"/>
             </w:tcBorders>
             <w:shd w:fill="D5E8F0" w:val="clear"/>
             <w:tcMar>
@@ -9406,10 +9322,7 @@
           <w:tcPr>
             <w:tcW w:type="dxa" w:w="1805"/>
             <w:tcBorders>
-              <w:top w:val="single" w:color="CCCCCC" w:sz="1"/>
-              <w:left w:val="single" w:color="CCCCCC" w:sz="1"/>
-              <w:bottom w:val="single" w:color="CCCCCC" w:sz="1"/>
-              <w:right w:val="single" w:color="CCCCCC" w:sz="1"/>
+              <w:bottom w:val="single" w:sz="6" w:space="0" w:color="auto"/>
             </w:tcBorders>
             <w:shd w:fill="D5E8F0" w:val="clear"/>
             <w:tcMar>
@@ -9432,10 +9345,7 @@
           <w:tcPr>
             <w:tcW w:type="dxa" w:w="1805"/>
             <w:tcBorders>
-              <w:top w:val="single" w:color="CCCCCC" w:sz="1"/>
-              <w:left w:val="single" w:color="CCCCCC" w:sz="1"/>
-              <w:bottom w:val="single" w:color="CCCCCC" w:sz="1"/>
-              <w:right w:val="single" w:color="CCCCCC" w:sz="1"/>
+              <w:bottom w:val="single" w:sz="6" w:space="0" w:color="auto"/>
             </w:tcBorders>
             <w:shd w:fill="D5E8F0" w:val="clear"/>
             <w:tcMar>
@@ -10493,12 +10403,12 @@
       <w:tblPr>
         <w:tblW w:type="dxa" w:w="9026"/>
         <w:tblBorders>
-          <w:top w:val="single" w:color="auto" w:sz="4"/>
-          <w:left w:val="single" w:color="auto" w:sz="4"/>
-          <w:bottom w:val="single" w:color="auto" w:sz="4"/>
-          <w:right w:val="single" w:color="auto" w:sz="4"/>
-          <w:insideH w:val="single" w:color="auto" w:sz="4"/>
-          <w:insideV w:val="single" w:color="auto" w:sz="4"/>
+          <w:top w:val="single" w:color="auto" w:sz="12" w:space="0"/>
+          <w:left w:val="none" w:color="auto" w:sz="0" w:space="0"/>
+          <w:bottom w:val="single" w:color="auto" w:sz="12" w:space="0"/>
+          <w:right w:val="none" w:color="auto" w:sz="0" w:space="0"/>
+          <w:insideH w:val="none" w:color="auto" w:sz="0" w:space="0"/>
+          <w:insideV w:val="none" w:color="auto" w:sz="0" w:space="0"/>
         </w:tblBorders>
       </w:tblPr>
       <w:tblGrid>
@@ -10511,10 +10421,7 @@
           <w:tcPr>
             <w:tcW w:type="dxa" w:w="3008"/>
             <w:tcBorders>
-              <w:top w:val="single" w:color="CCCCCC" w:sz="1"/>
-              <w:left w:val="single" w:color="CCCCCC" w:sz="1"/>
-              <w:bottom w:val="single" w:color="CCCCCC" w:sz="1"/>
-              <w:right w:val="single" w:color="CCCCCC" w:sz="1"/>
+              <w:bottom w:val="single" w:sz="6" w:space="0" w:color="auto"/>
             </w:tcBorders>
             <w:shd w:fill="D5E8F0" w:val="clear"/>
             <w:tcMar>
@@ -10537,10 +10444,7 @@
           <w:tcPr>
             <w:tcW w:type="dxa" w:w="3008"/>
             <w:tcBorders>
-              <w:top w:val="single" w:color="CCCCCC" w:sz="1"/>
-              <w:left w:val="single" w:color="CCCCCC" w:sz="1"/>
-              <w:bottom w:val="single" w:color="CCCCCC" w:sz="1"/>
-              <w:right w:val="single" w:color="CCCCCC" w:sz="1"/>
+              <w:bottom w:val="single" w:sz="6" w:space="0" w:color="auto"/>
             </w:tcBorders>
             <w:shd w:fill="D5E8F0" w:val="clear"/>
             <w:tcMar>
@@ -10563,10 +10467,7 @@
           <w:tcPr>
             <w:tcW w:type="dxa" w:w="3008"/>
             <w:tcBorders>
-              <w:top w:val="single" w:color="CCCCCC" w:sz="1"/>
-              <w:left w:val="single" w:color="CCCCCC" w:sz="1"/>
-              <w:bottom w:val="single" w:color="CCCCCC" w:sz="1"/>
-              <w:right w:val="single" w:color="CCCCCC" w:sz="1"/>
+              <w:bottom w:val="single" w:sz="6" w:space="0" w:color="auto"/>
             </w:tcBorders>
             <w:shd w:fill="D5E8F0" w:val="clear"/>
             <w:tcMar>
@@ -11009,12 +10910,12 @@
       <w:tblPr>
         <w:tblW w:type="dxa" w:w="9026"/>
         <w:tblBorders>
-          <w:top w:val="single" w:color="auto" w:sz="4"/>
-          <w:left w:val="single" w:color="auto" w:sz="4"/>
-          <w:bottom w:val="single" w:color="auto" w:sz="4"/>
-          <w:right w:val="single" w:color="auto" w:sz="4"/>
-          <w:insideH w:val="single" w:color="auto" w:sz="4"/>
-          <w:insideV w:val="single" w:color="auto" w:sz="4"/>
+          <w:top w:val="single" w:color="auto" w:sz="12" w:space="0"/>
+          <w:left w:val="none" w:color="auto" w:sz="0" w:space="0"/>
+          <w:bottom w:val="single" w:color="auto" w:sz="12" w:space="0"/>
+          <w:right w:val="none" w:color="auto" w:sz="0" w:space="0"/>
+          <w:insideH w:val="none" w:color="auto" w:sz="0" w:space="0"/>
+          <w:insideV w:val="none" w:color="auto" w:sz="0" w:space="0"/>
         </w:tblBorders>
       </w:tblPr>
       <w:tblGrid>
@@ -11027,10 +10928,7 @@
           <w:tcPr>
             <w:tcW w:type="dxa" w:w="3008"/>
             <w:tcBorders>
-              <w:top w:val="single" w:color="CCCCCC" w:sz="1"/>
-              <w:left w:val="single" w:color="CCCCCC" w:sz="1"/>
-              <w:bottom w:val="single" w:color="CCCCCC" w:sz="1"/>
-              <w:right w:val="single" w:color="CCCCCC" w:sz="1"/>
+              <w:bottom w:val="single" w:sz="6" w:space="0" w:color="auto"/>
             </w:tcBorders>
             <w:shd w:fill="D5E8F0" w:val="clear"/>
             <w:tcMar>
@@ -11053,10 +10951,7 @@
           <w:tcPr>
             <w:tcW w:type="dxa" w:w="3008"/>
             <w:tcBorders>
-              <w:top w:val="single" w:color="CCCCCC" w:sz="1"/>
-              <w:left w:val="single" w:color="CCCCCC" w:sz="1"/>
-              <w:bottom w:val="single" w:color="CCCCCC" w:sz="1"/>
-              <w:right w:val="single" w:color="CCCCCC" w:sz="1"/>
+              <w:bottom w:val="single" w:sz="6" w:space="0" w:color="auto"/>
             </w:tcBorders>
             <w:shd w:fill="D5E8F0" w:val="clear"/>
             <w:tcMar>
@@ -11079,10 +10974,7 @@
           <w:tcPr>
             <w:tcW w:type="dxa" w:w="3008"/>
             <w:tcBorders>
-              <w:top w:val="single" w:color="CCCCCC" w:sz="1"/>
-              <w:left w:val="single" w:color="CCCCCC" w:sz="1"/>
-              <w:bottom w:val="single" w:color="CCCCCC" w:sz="1"/>
-              <w:right w:val="single" w:color="CCCCCC" w:sz="1"/>
+              <w:bottom w:val="single" w:sz="6" w:space="0" w:color="auto"/>
             </w:tcBorders>
             <w:shd w:fill="D5E8F0" w:val="clear"/>
             <w:tcMar>
@@ -11687,12 +11579,12 @@
       <w:tblPr>
         <w:tblW w:type="dxa" w:w="9026"/>
         <w:tblBorders>
-          <w:top w:val="single" w:color="auto" w:sz="4"/>
-          <w:left w:val="single" w:color="auto" w:sz="4"/>
-          <w:bottom w:val="single" w:color="auto" w:sz="4"/>
-          <w:right w:val="single" w:color="auto" w:sz="4"/>
-          <w:insideH w:val="single" w:color="auto" w:sz="4"/>
-          <w:insideV w:val="single" w:color="auto" w:sz="4"/>
+          <w:top w:val="single" w:color="auto" w:sz="12" w:space="0"/>
+          <w:left w:val="none" w:color="auto" w:sz="0" w:space="0"/>
+          <w:bottom w:val="single" w:color="auto" w:sz="12" w:space="0"/>
+          <w:right w:val="none" w:color="auto" w:sz="0" w:space="0"/>
+          <w:insideH w:val="none" w:color="auto" w:sz="0" w:space="0"/>
+          <w:insideV w:val="none" w:color="auto" w:sz="0" w:space="0"/>
         </w:tblBorders>
       </w:tblPr>
       <w:tblGrid>
@@ -11706,10 +11598,7 @@
           <w:tcPr>
             <w:tcW w:type="dxa" w:w="2256"/>
             <w:tcBorders>
-              <w:top w:val="single" w:color="CCCCCC" w:sz="1"/>
-              <w:left w:val="single" w:color="CCCCCC" w:sz="1"/>
-              <w:bottom w:val="single" w:color="CCCCCC" w:sz="1"/>
-              <w:right w:val="single" w:color="CCCCCC" w:sz="1"/>
+              <w:bottom w:val="single" w:sz="6" w:space="0" w:color="auto"/>
             </w:tcBorders>
             <w:shd w:fill="D5E8F0" w:val="clear"/>
             <w:tcMar>
@@ -11732,10 +11621,7 @@
           <w:tcPr>
             <w:tcW w:type="dxa" w:w="2256"/>
             <w:tcBorders>
-              <w:top w:val="single" w:color="CCCCCC" w:sz="1"/>
-              <w:left w:val="single" w:color="CCCCCC" w:sz="1"/>
-              <w:bottom w:val="single" w:color="CCCCCC" w:sz="1"/>
-              <w:right w:val="single" w:color="CCCCCC" w:sz="1"/>
+              <w:bottom w:val="single" w:sz="6" w:space="0" w:color="auto"/>
             </w:tcBorders>
             <w:shd w:fill="D5E8F0" w:val="clear"/>
             <w:tcMar>
@@ -11758,10 +11644,7 @@
           <w:tcPr>
             <w:tcW w:type="dxa" w:w="2256"/>
             <w:tcBorders>
-              <w:top w:val="single" w:color="CCCCCC" w:sz="1"/>
-              <w:left w:val="single" w:color="CCCCCC" w:sz="1"/>
-              <w:bottom w:val="single" w:color="CCCCCC" w:sz="1"/>
-              <w:right w:val="single" w:color="CCCCCC" w:sz="1"/>
+              <w:bottom w:val="single" w:sz="6" w:space="0" w:color="auto"/>
             </w:tcBorders>
             <w:shd w:fill="D5E8F0" w:val="clear"/>
             <w:tcMar>
@@ -11784,10 +11667,7 @@
           <w:tcPr>
             <w:tcW w:type="dxa" w:w="2256"/>
             <w:tcBorders>
-              <w:top w:val="single" w:color="CCCCCC" w:sz="1"/>
-              <w:left w:val="single" w:color="CCCCCC" w:sz="1"/>
-              <w:bottom w:val="single" w:color="CCCCCC" w:sz="1"/>
-              <w:right w:val="single" w:color="CCCCCC" w:sz="1"/>
+              <w:bottom w:val="single" w:sz="6" w:space="0" w:color="auto"/>
             </w:tcBorders>
             <w:shd w:fill="D5E8F0" w:val="clear"/>
             <w:tcMar>
@@ -12151,12 +12031,12 @@
       <w:tblPr>
         <w:tblW w:type="dxa" w:w="9026"/>
         <w:tblBorders>
-          <w:top w:val="single" w:color="auto" w:sz="4"/>
-          <w:left w:val="single" w:color="auto" w:sz="4"/>
-          <w:bottom w:val="single" w:color="auto" w:sz="4"/>
-          <w:right w:val="single" w:color="auto" w:sz="4"/>
-          <w:insideH w:val="single" w:color="auto" w:sz="4"/>
-          <w:insideV w:val="single" w:color="auto" w:sz="4"/>
+          <w:top w:val="single" w:color="auto" w:sz="12" w:space="0"/>
+          <w:left w:val="none" w:color="auto" w:sz="0" w:space="0"/>
+          <w:bottom w:val="single" w:color="auto" w:sz="12" w:space="0"/>
+          <w:right w:val="none" w:color="auto" w:sz="0" w:space="0"/>
+          <w:insideH w:val="none" w:color="auto" w:sz="0" w:space="0"/>
+          <w:insideV w:val="none" w:color="auto" w:sz="0" w:space="0"/>
         </w:tblBorders>
       </w:tblPr>
       <w:tblGrid>
@@ -12169,10 +12049,7 @@
           <w:tcPr>
             <w:tcW w:type="dxa" w:w="3008"/>
             <w:tcBorders>
-              <w:top w:val="single" w:color="CCCCCC" w:sz="1"/>
-              <w:left w:val="single" w:color="CCCCCC" w:sz="1"/>
-              <w:bottom w:val="single" w:color="CCCCCC" w:sz="1"/>
-              <w:right w:val="single" w:color="CCCCCC" w:sz="1"/>
+              <w:bottom w:val="single" w:sz="6" w:space="0" w:color="auto"/>
             </w:tcBorders>
             <w:shd w:fill="D5E8F0" w:val="clear"/>
             <w:tcMar>
@@ -12195,10 +12072,7 @@
           <w:tcPr>
             <w:tcW w:type="dxa" w:w="3008"/>
             <w:tcBorders>
-              <w:top w:val="single" w:color="CCCCCC" w:sz="1"/>
-              <w:left w:val="single" w:color="CCCCCC" w:sz="1"/>
-              <w:bottom w:val="single" w:color="CCCCCC" w:sz="1"/>
-              <w:right w:val="single" w:color="CCCCCC" w:sz="1"/>
+              <w:bottom w:val="single" w:sz="6" w:space="0" w:color="auto"/>
             </w:tcBorders>
             <w:shd w:fill="D5E8F0" w:val="clear"/>
             <w:tcMar>
@@ -12221,10 +12095,7 @@
           <w:tcPr>
             <w:tcW w:type="dxa" w:w="3008"/>
             <w:tcBorders>
-              <w:top w:val="single" w:color="CCCCCC" w:sz="1"/>
-              <w:left w:val="single" w:color="CCCCCC" w:sz="1"/>
-              <w:bottom w:val="single" w:color="CCCCCC" w:sz="1"/>
-              <w:right w:val="single" w:color="CCCCCC" w:sz="1"/>
+              <w:bottom w:val="single" w:sz="6" w:space="0" w:color="auto"/>
             </w:tcBorders>
             <w:shd w:fill="D5E8F0" w:val="clear"/>
             <w:tcMar>
@@ -12463,12 +12334,12 @@
       <w:tblPr>
         <w:tblW w:type="dxa" w:w="9026"/>
         <w:tblBorders>
-          <w:top w:val="single" w:color="auto" w:sz="4"/>
-          <w:left w:val="single" w:color="auto" w:sz="4"/>
-          <w:bottom w:val="single" w:color="auto" w:sz="4"/>
-          <w:right w:val="single" w:color="auto" w:sz="4"/>
-          <w:insideH w:val="single" w:color="auto" w:sz="4"/>
-          <w:insideV w:val="single" w:color="auto" w:sz="4"/>
+          <w:top w:val="single" w:color="auto" w:sz="12" w:space="0"/>
+          <w:left w:val="none" w:color="auto" w:sz="0" w:space="0"/>
+          <w:bottom w:val="single" w:color="auto" w:sz="12" w:space="0"/>
+          <w:right w:val="none" w:color="auto" w:sz="0" w:space="0"/>
+          <w:insideH w:val="none" w:color="auto" w:sz="0" w:space="0"/>
+          <w:insideV w:val="none" w:color="auto" w:sz="0" w:space="0"/>
         </w:tblBorders>
       </w:tblPr>
       <w:tblGrid>
@@ -12481,10 +12352,7 @@
           <w:tcPr>
             <w:tcW w:type="dxa" w:w="3008"/>
             <w:tcBorders>
-              <w:top w:val="single" w:color="CCCCCC" w:sz="1"/>
-              <w:left w:val="single" w:color="CCCCCC" w:sz="1"/>
-              <w:bottom w:val="single" w:color="CCCCCC" w:sz="1"/>
-              <w:right w:val="single" w:color="CCCCCC" w:sz="1"/>
+              <w:bottom w:val="single" w:sz="6" w:space="0" w:color="auto"/>
             </w:tcBorders>
             <w:shd w:fill="D5E8F0" w:val="clear"/>
             <w:tcMar>
@@ -12507,10 +12375,7 @@
           <w:tcPr>
             <w:tcW w:type="dxa" w:w="3008"/>
             <w:tcBorders>
-              <w:top w:val="single" w:color="CCCCCC" w:sz="1"/>
-              <w:left w:val="single" w:color="CCCCCC" w:sz="1"/>
-              <w:bottom w:val="single" w:color="CCCCCC" w:sz="1"/>
-              <w:right w:val="single" w:color="CCCCCC" w:sz="1"/>
+              <w:bottom w:val="single" w:sz="6" w:space="0" w:color="auto"/>
             </w:tcBorders>
             <w:shd w:fill="D5E8F0" w:val="clear"/>
             <w:tcMar>
@@ -12533,10 +12398,7 @@
           <w:tcPr>
             <w:tcW w:type="dxa" w:w="3008"/>
             <w:tcBorders>
-              <w:top w:val="single" w:color="CCCCCC" w:sz="1"/>
-              <w:left w:val="single" w:color="CCCCCC" w:sz="1"/>
-              <w:bottom w:val="single" w:color="CCCCCC" w:sz="1"/>
-              <w:right w:val="single" w:color="CCCCCC" w:sz="1"/>
+              <w:bottom w:val="single" w:sz="6" w:space="0" w:color="auto"/>
             </w:tcBorders>
             <w:shd w:fill="D5E8F0" w:val="clear"/>
             <w:tcMar>
@@ -12977,12 +12839,12 @@
       <w:tblPr>
         <w:tblW w:type="dxa" w:w="9026"/>
         <w:tblBorders>
-          <w:top w:val="single" w:color="auto" w:sz="4"/>
-          <w:left w:val="single" w:color="auto" w:sz="4"/>
-          <w:bottom w:val="single" w:color="auto" w:sz="4"/>
-          <w:right w:val="single" w:color="auto" w:sz="4"/>
-          <w:insideH w:val="single" w:color="auto" w:sz="4"/>
-          <w:insideV w:val="single" w:color="auto" w:sz="4"/>
+          <w:top w:val="single" w:color="auto" w:sz="12" w:space="0"/>
+          <w:left w:val="none" w:color="auto" w:sz="0" w:space="0"/>
+          <w:bottom w:val="single" w:color="auto" w:sz="12" w:space="0"/>
+          <w:right w:val="none" w:color="auto" w:sz="0" w:space="0"/>
+          <w:insideH w:val="none" w:color="auto" w:sz="0" w:space="0"/>
+          <w:insideV w:val="none" w:color="auto" w:sz="0" w:space="0"/>
         </w:tblBorders>
       </w:tblPr>
       <w:tblGrid>
@@ -12999,10 +12861,7 @@
           <w:tcPr>
             <w:tcW w:type="dxa" w:w="1289"/>
             <w:tcBorders>
-              <w:top w:val="single" w:color="CCCCCC" w:sz="1"/>
-              <w:left w:val="single" w:color="CCCCCC" w:sz="1"/>
-              <w:bottom w:val="single" w:color="CCCCCC" w:sz="1"/>
-              <w:right w:val="single" w:color="CCCCCC" w:sz="1"/>
+              <w:bottom w:val="single" w:sz="6" w:space="0" w:color="auto"/>
             </w:tcBorders>
             <w:shd w:fill="D5E8F0" w:val="clear"/>
             <w:tcMar>
@@ -13025,10 +12884,7 @@
           <w:tcPr>
             <w:tcW w:type="dxa" w:w="1289"/>
             <w:tcBorders>
-              <w:top w:val="single" w:color="CCCCCC" w:sz="1"/>
-              <w:left w:val="single" w:color="CCCCCC" w:sz="1"/>
-              <w:bottom w:val="single" w:color="CCCCCC" w:sz="1"/>
-              <w:right w:val="single" w:color="CCCCCC" w:sz="1"/>
+              <w:bottom w:val="single" w:sz="6" w:space="0" w:color="auto"/>
             </w:tcBorders>
             <w:shd w:fill="D5E8F0" w:val="clear"/>
             <w:tcMar>
@@ -13051,10 +12907,7 @@
           <w:tcPr>
             <w:tcW w:type="dxa" w:w="1289"/>
             <w:tcBorders>
-              <w:top w:val="single" w:color="CCCCCC" w:sz="1"/>
-              <w:left w:val="single" w:color="CCCCCC" w:sz="1"/>
-              <w:bottom w:val="single" w:color="CCCCCC" w:sz="1"/>
-              <w:right w:val="single" w:color="CCCCCC" w:sz="1"/>
+              <w:bottom w:val="single" w:sz="6" w:space="0" w:color="auto"/>
             </w:tcBorders>
             <w:shd w:fill="D5E8F0" w:val="clear"/>
             <w:tcMar>
@@ -13077,10 +12930,7 @@
           <w:tcPr>
             <w:tcW w:type="dxa" w:w="1289"/>
             <w:tcBorders>
-              <w:top w:val="single" w:color="CCCCCC" w:sz="1"/>
-              <w:left w:val="single" w:color="CCCCCC" w:sz="1"/>
-              <w:bottom w:val="single" w:color="CCCCCC" w:sz="1"/>
-              <w:right w:val="single" w:color="CCCCCC" w:sz="1"/>
+              <w:bottom w:val="single" w:sz="6" w:space="0" w:color="auto"/>
             </w:tcBorders>
             <w:shd w:fill="D5E8F0" w:val="clear"/>
             <w:tcMar>
@@ -13103,10 +12953,7 @@
           <w:tcPr>
             <w:tcW w:type="dxa" w:w="1289"/>
             <w:tcBorders>
-              <w:top w:val="single" w:color="CCCCCC" w:sz="1"/>
-              <w:left w:val="single" w:color="CCCCCC" w:sz="1"/>
-              <w:bottom w:val="single" w:color="CCCCCC" w:sz="1"/>
-              <w:right w:val="single" w:color="CCCCCC" w:sz="1"/>
+              <w:bottom w:val="single" w:sz="6" w:space="0" w:color="auto"/>
             </w:tcBorders>
             <w:shd w:fill="D5E8F0" w:val="clear"/>
             <w:tcMar>
@@ -13129,10 +12976,7 @@
           <w:tcPr>
             <w:tcW w:type="dxa" w:w="1289"/>
             <w:tcBorders>
-              <w:top w:val="single" w:color="CCCCCC" w:sz="1"/>
-              <w:left w:val="single" w:color="CCCCCC" w:sz="1"/>
-              <w:bottom w:val="single" w:color="CCCCCC" w:sz="1"/>
-              <w:right w:val="single" w:color="CCCCCC" w:sz="1"/>
+              <w:bottom w:val="single" w:sz="6" w:space="0" w:color="auto"/>
             </w:tcBorders>
             <w:shd w:fill="D5E8F0" w:val="clear"/>
             <w:tcMar>
@@ -13155,10 +12999,7 @@
           <w:tcPr>
             <w:tcW w:type="dxa" w:w="1289"/>
             <w:tcBorders>
-              <w:top w:val="single" w:color="CCCCCC" w:sz="1"/>
-              <w:left w:val="single" w:color="CCCCCC" w:sz="1"/>
-              <w:bottom w:val="single" w:color="CCCCCC" w:sz="1"/>
-              <w:right w:val="single" w:color="CCCCCC" w:sz="1"/>
+              <w:bottom w:val="single" w:sz="6" w:space="0" w:color="auto"/>
             </w:tcBorders>
             <w:shd w:fill="D5E8F0" w:val="clear"/>
             <w:tcMar>
@@ -13570,12 +13411,12 @@
       <w:tblPr>
         <w:tblW w:type="dxa" w:w="9026"/>
         <w:tblBorders>
-          <w:top w:val="single" w:color="auto" w:sz="4"/>
-          <w:left w:val="single" w:color="auto" w:sz="4"/>
-          <w:bottom w:val="single" w:color="auto" w:sz="4"/>
-          <w:right w:val="single" w:color="auto" w:sz="4"/>
-          <w:insideH w:val="single" w:color="auto" w:sz="4"/>
-          <w:insideV w:val="single" w:color="auto" w:sz="4"/>
+          <w:top w:val="single" w:color="auto" w:sz="12" w:space="0"/>
+          <w:left w:val="none" w:color="auto" w:sz="0" w:space="0"/>
+          <w:bottom w:val="single" w:color="auto" w:sz="12" w:space="0"/>
+          <w:right w:val="none" w:color="auto" w:sz="0" w:space="0"/>
+          <w:insideH w:val="none" w:color="auto" w:sz="0" w:space="0"/>
+          <w:insideV w:val="none" w:color="auto" w:sz="0" w:space="0"/>
         </w:tblBorders>
       </w:tblPr>
       <w:tblGrid>
@@ -13588,10 +13429,7 @@
           <w:tcPr>
             <w:tcW w:type="dxa" w:w="3008"/>
             <w:tcBorders>
-              <w:top w:val="single" w:color="CCCCCC" w:sz="1"/>
-              <w:left w:val="single" w:color="CCCCCC" w:sz="1"/>
-              <w:bottom w:val="single" w:color="CCCCCC" w:sz="1"/>
-              <w:right w:val="single" w:color="CCCCCC" w:sz="1"/>
+              <w:bottom w:val="single" w:sz="6" w:space="0" w:color="auto"/>
             </w:tcBorders>
             <w:shd w:fill="D5E8F0" w:val="clear"/>
             <w:tcMar>
@@ -13614,10 +13452,7 @@
           <w:tcPr>
             <w:tcW w:type="dxa" w:w="3008"/>
             <w:tcBorders>
-              <w:top w:val="single" w:color="CCCCCC" w:sz="1"/>
-              <w:left w:val="single" w:color="CCCCCC" w:sz="1"/>
-              <w:bottom w:val="single" w:color="CCCCCC" w:sz="1"/>
-              <w:right w:val="single" w:color="CCCCCC" w:sz="1"/>
+              <w:bottom w:val="single" w:sz="6" w:space="0" w:color="auto"/>
             </w:tcBorders>
             <w:shd w:fill="D5E8F0" w:val="clear"/>
             <w:tcMar>
@@ -13640,10 +13475,7 @@
           <w:tcPr>
             <w:tcW w:type="dxa" w:w="3008"/>
             <w:tcBorders>
-              <w:top w:val="single" w:color="CCCCCC" w:sz="1"/>
-              <w:left w:val="single" w:color="CCCCCC" w:sz="1"/>
-              <w:bottom w:val="single" w:color="CCCCCC" w:sz="1"/>
-              <w:right w:val="single" w:color="CCCCCC" w:sz="1"/>
+              <w:bottom w:val="single" w:sz="6" w:space="0" w:color="auto"/>
             </w:tcBorders>
             <w:shd w:fill="D5E8F0" w:val="clear"/>
             <w:tcMar>
@@ -14361,12 +14193,12 @@
       <w:tblPr>
         <w:tblW w:type="dxa" w:w="9026"/>
         <w:tblBorders>
-          <w:top w:val="single" w:color="auto" w:sz="4"/>
-          <w:left w:val="single" w:color="auto" w:sz="4"/>
-          <w:bottom w:val="single" w:color="auto" w:sz="4"/>
-          <w:right w:val="single" w:color="auto" w:sz="4"/>
-          <w:insideH w:val="single" w:color="auto" w:sz="4"/>
-          <w:insideV w:val="single" w:color="auto" w:sz="4"/>
+          <w:top w:val="single" w:color="auto" w:sz="12" w:space="0"/>
+          <w:left w:val="none" w:color="auto" w:sz="0" w:space="0"/>
+          <w:bottom w:val="single" w:color="auto" w:sz="12" w:space="0"/>
+          <w:right w:val="none" w:color="auto" w:sz="0" w:space="0"/>
+          <w:insideH w:val="none" w:color="auto" w:sz="0" w:space="0"/>
+          <w:insideV w:val="none" w:color="auto" w:sz="0" w:space="0"/>
         </w:tblBorders>
       </w:tblPr>
       <w:tblGrid>
@@ -14379,10 +14211,7 @@
           <w:tcPr>
             <w:tcW w:type="dxa" w:w="3008"/>
             <w:tcBorders>
-              <w:top w:val="single" w:color="CCCCCC" w:sz="1"/>
-              <w:left w:val="single" w:color="CCCCCC" w:sz="1"/>
-              <w:bottom w:val="single" w:color="CCCCCC" w:sz="1"/>
-              <w:right w:val="single" w:color="CCCCCC" w:sz="1"/>
+              <w:bottom w:val="single" w:sz="6" w:space="0" w:color="auto"/>
             </w:tcBorders>
             <w:shd w:fill="D5E8F0" w:val="clear"/>
             <w:tcMar>
@@ -14405,10 +14234,7 @@
           <w:tcPr>
             <w:tcW w:type="dxa" w:w="3008"/>
             <w:tcBorders>
-              <w:top w:val="single" w:color="CCCCCC" w:sz="1"/>
-              <w:left w:val="single" w:color="CCCCCC" w:sz="1"/>
-              <w:bottom w:val="single" w:color="CCCCCC" w:sz="1"/>
-              <w:right w:val="single" w:color="CCCCCC" w:sz="1"/>
+              <w:bottom w:val="single" w:sz="6" w:space="0" w:color="auto"/>
             </w:tcBorders>
             <w:shd w:fill="D5E8F0" w:val="clear"/>
             <w:tcMar>
@@ -14431,10 +14257,7 @@
           <w:tcPr>
             <w:tcW w:type="dxa" w:w="3008"/>
             <w:tcBorders>
-              <w:top w:val="single" w:color="CCCCCC" w:sz="1"/>
-              <w:left w:val="single" w:color="CCCCCC" w:sz="1"/>
-              <w:bottom w:val="single" w:color="CCCCCC" w:sz="1"/>
-              <w:right w:val="single" w:color="CCCCCC" w:sz="1"/>
+              <w:bottom w:val="single" w:sz="6" w:space="0" w:color="auto"/>
             </w:tcBorders>
             <w:shd w:fill="D5E8F0" w:val="clear"/>
             <w:tcMar>
@@ -14736,12 +14559,12 @@
       <w:tblPr>
         <w:tblW w:type="dxa" w:w="9026"/>
         <w:tblBorders>
-          <w:top w:val="single" w:color="auto" w:sz="4"/>
-          <w:left w:val="single" w:color="auto" w:sz="4"/>
-          <w:bottom w:val="single" w:color="auto" w:sz="4"/>
-          <w:right w:val="single" w:color="auto" w:sz="4"/>
-          <w:insideH w:val="single" w:color="auto" w:sz="4"/>
-          <w:insideV w:val="single" w:color="auto" w:sz="4"/>
+          <w:top w:val="single" w:color="auto" w:sz="12" w:space="0"/>
+          <w:left w:val="none" w:color="auto" w:sz="0" w:space="0"/>
+          <w:bottom w:val="single" w:color="auto" w:sz="12" w:space="0"/>
+          <w:right w:val="none" w:color="auto" w:sz="0" w:space="0"/>
+          <w:insideH w:val="none" w:color="auto" w:sz="0" w:space="0"/>
+          <w:insideV w:val="none" w:color="auto" w:sz="0" w:space="0"/>
         </w:tblBorders>
       </w:tblPr>
       <w:tblGrid>
@@ -14755,10 +14578,7 @@
           <w:tcPr>
             <w:tcW w:type="dxa" w:w="2256"/>
             <w:tcBorders>
-              <w:top w:val="single" w:color="CCCCCC" w:sz="1"/>
-              <w:left w:val="single" w:color="CCCCCC" w:sz="1"/>
-              <w:bottom w:val="single" w:color="CCCCCC" w:sz="1"/>
-              <w:right w:val="single" w:color="CCCCCC" w:sz="1"/>
+              <w:bottom w:val="single" w:sz="6" w:space="0" w:color="auto"/>
             </w:tcBorders>
             <w:shd w:fill="D5E8F0" w:val="clear"/>
             <w:tcMar>
@@ -14781,10 +14601,7 @@
           <w:tcPr>
             <w:tcW w:type="dxa" w:w="2256"/>
             <w:tcBorders>
-              <w:top w:val="single" w:color="CCCCCC" w:sz="1"/>
-              <w:left w:val="single" w:color="CCCCCC" w:sz="1"/>
-              <w:bottom w:val="single" w:color="CCCCCC" w:sz="1"/>
-              <w:right w:val="single" w:color="CCCCCC" w:sz="1"/>
+              <w:bottom w:val="single" w:sz="6" w:space="0" w:color="auto"/>
             </w:tcBorders>
             <w:shd w:fill="D5E8F0" w:val="clear"/>
             <w:tcMar>
@@ -14807,10 +14624,7 @@
           <w:tcPr>
             <w:tcW w:type="dxa" w:w="2256"/>
             <w:tcBorders>
-              <w:top w:val="single" w:color="CCCCCC" w:sz="1"/>
-              <w:left w:val="single" w:color="CCCCCC" w:sz="1"/>
-              <w:bottom w:val="single" w:color="CCCCCC" w:sz="1"/>
-              <w:right w:val="single" w:color="CCCCCC" w:sz="1"/>
+              <w:bottom w:val="single" w:sz="6" w:space="0" w:color="auto"/>
             </w:tcBorders>
             <w:shd w:fill="D5E8F0" w:val="clear"/>
             <w:tcMar>
@@ -14833,10 +14647,7 @@
           <w:tcPr>
             <w:tcW w:type="dxa" w:w="2256"/>
             <w:tcBorders>
-              <w:top w:val="single" w:color="CCCCCC" w:sz="1"/>
-              <w:left w:val="single" w:color="CCCCCC" w:sz="1"/>
-              <w:bottom w:val="single" w:color="CCCCCC" w:sz="1"/>
-              <w:right w:val="single" w:color="CCCCCC" w:sz="1"/>
+              <w:bottom w:val="single" w:sz="6" w:space="0" w:color="auto"/>
             </w:tcBorders>
             <w:shd w:fill="D5E8F0" w:val="clear"/>
             <w:tcMar>
@@ -15109,12 +14920,12 @@
       <w:tblPr>
         <w:tblW w:type="dxa" w:w="9026"/>
         <w:tblBorders>
-          <w:top w:val="single" w:color="auto" w:sz="4"/>
-          <w:left w:val="single" w:color="auto" w:sz="4"/>
-          <w:bottom w:val="single" w:color="auto" w:sz="4"/>
-          <w:right w:val="single" w:color="auto" w:sz="4"/>
-          <w:insideH w:val="single" w:color="auto" w:sz="4"/>
-          <w:insideV w:val="single" w:color="auto" w:sz="4"/>
+          <w:top w:val="single" w:color="auto" w:sz="12" w:space="0"/>
+          <w:left w:val="none" w:color="auto" w:sz="0" w:space="0"/>
+          <w:bottom w:val="single" w:color="auto" w:sz="12" w:space="0"/>
+          <w:right w:val="none" w:color="auto" w:sz="0" w:space="0"/>
+          <w:insideH w:val="none" w:color="auto" w:sz="0" w:space="0"/>
+          <w:insideV w:val="none" w:color="auto" w:sz="0" w:space="0"/>
         </w:tblBorders>
       </w:tblPr>
       <w:tblGrid>
@@ -15127,10 +14938,7 @@
           <w:tcPr>
             <w:tcW w:type="dxa" w:w="3008"/>
             <w:tcBorders>
-              <w:top w:val="single" w:color="CCCCCC" w:sz="1"/>
-              <w:left w:val="single" w:color="CCCCCC" w:sz="1"/>
-              <w:bottom w:val="single" w:color="CCCCCC" w:sz="1"/>
-              <w:right w:val="single" w:color="CCCCCC" w:sz="1"/>
+              <w:bottom w:val="single" w:sz="6" w:space="0" w:color="auto"/>
             </w:tcBorders>
             <w:shd w:fill="D5E8F0" w:val="clear"/>
             <w:tcMar>
@@ -15153,10 +14961,7 @@
           <w:tcPr>
             <w:tcW w:type="dxa" w:w="3008"/>
             <w:tcBorders>
-              <w:top w:val="single" w:color="CCCCCC" w:sz="1"/>
-              <w:left w:val="single" w:color="CCCCCC" w:sz="1"/>
-              <w:bottom w:val="single" w:color="CCCCCC" w:sz="1"/>
-              <w:right w:val="single" w:color="CCCCCC" w:sz="1"/>
+              <w:bottom w:val="single" w:sz="6" w:space="0" w:color="auto"/>
             </w:tcBorders>
             <w:shd w:fill="D5E8F0" w:val="clear"/>
             <w:tcMar>
@@ -15179,10 +14984,7 @@
           <w:tcPr>
             <w:tcW w:type="dxa" w:w="3008"/>
             <w:tcBorders>
-              <w:top w:val="single" w:color="CCCCCC" w:sz="1"/>
-              <w:left w:val="single" w:color="CCCCCC" w:sz="1"/>
-              <w:bottom w:val="single" w:color="CCCCCC" w:sz="1"/>
-              <w:right w:val="single" w:color="CCCCCC" w:sz="1"/>
+              <w:bottom w:val="single" w:sz="6" w:space="0" w:color="auto"/>
             </w:tcBorders>
             <w:shd w:fill="D5E8F0" w:val="clear"/>
             <w:tcMar>
@@ -15651,12 +15453,12 @@
       <w:tblPr>
         <w:tblW w:type="dxa" w:w="9026"/>
         <w:tblBorders>
-          <w:top w:val="single" w:color="auto" w:sz="4"/>
-          <w:left w:val="single" w:color="auto" w:sz="4"/>
-          <w:bottom w:val="single" w:color="auto" w:sz="4"/>
-          <w:right w:val="single" w:color="auto" w:sz="4"/>
-          <w:insideH w:val="single" w:color="auto" w:sz="4"/>
-          <w:insideV w:val="single" w:color="auto" w:sz="4"/>
+          <w:top w:val="single" w:color="auto" w:sz="12" w:space="0"/>
+          <w:left w:val="none" w:color="auto" w:sz="0" w:space="0"/>
+          <w:bottom w:val="single" w:color="auto" w:sz="12" w:space="0"/>
+          <w:right w:val="none" w:color="auto" w:sz="0" w:space="0"/>
+          <w:insideH w:val="none" w:color="auto" w:sz="0" w:space="0"/>
+          <w:insideV w:val="none" w:color="auto" w:sz="0" w:space="0"/>
         </w:tblBorders>
       </w:tblPr>
       <w:tblGrid>
@@ -15669,10 +15471,7 @@
           <w:tcPr>
             <w:tcW w:type="dxa" w:w="3008"/>
             <w:tcBorders>
-              <w:top w:val="single" w:color="CCCCCC" w:sz="1"/>
-              <w:left w:val="single" w:color="CCCCCC" w:sz="1"/>
-              <w:bottom w:val="single" w:color="CCCCCC" w:sz="1"/>
-              <w:right w:val="single" w:color="CCCCCC" w:sz="1"/>
+              <w:bottom w:val="single" w:sz="6" w:space="0" w:color="auto"/>
             </w:tcBorders>
             <w:shd w:fill="D5E8F0" w:val="clear"/>
             <w:tcMar>
@@ -15695,10 +15494,7 @@
           <w:tcPr>
             <w:tcW w:type="dxa" w:w="3008"/>
             <w:tcBorders>
-              <w:top w:val="single" w:color="CCCCCC" w:sz="1"/>
-              <w:left w:val="single" w:color="CCCCCC" w:sz="1"/>
-              <w:bottom w:val="single" w:color="CCCCCC" w:sz="1"/>
-              <w:right w:val="single" w:color="CCCCCC" w:sz="1"/>
+              <w:bottom w:val="single" w:sz="6" w:space="0" w:color="auto"/>
             </w:tcBorders>
             <w:shd w:fill="D5E8F0" w:val="clear"/>
             <w:tcMar>
@@ -15721,10 +15517,7 @@
           <w:tcPr>
             <w:tcW w:type="dxa" w:w="3008"/>
             <w:tcBorders>
-              <w:top w:val="single" w:color="CCCCCC" w:sz="1"/>
-              <w:left w:val="single" w:color="CCCCCC" w:sz="1"/>
-              <w:bottom w:val="single" w:color="CCCCCC" w:sz="1"/>
-              <w:right w:val="single" w:color="CCCCCC" w:sz="1"/>
+              <w:bottom w:val="single" w:sz="6" w:space="0" w:color="auto"/>
             </w:tcBorders>
             <w:shd w:fill="D5E8F0" w:val="clear"/>
             <w:tcMar>
@@ -16076,12 +15869,12 @@
       <w:tblPr>
         <w:tblW w:type="dxa" w:w="9026"/>
         <w:tblBorders>
-          <w:top w:val="single" w:color="auto" w:sz="4"/>
-          <w:left w:val="single" w:color="auto" w:sz="4"/>
-          <w:bottom w:val="single" w:color="auto" w:sz="4"/>
-          <w:right w:val="single" w:color="auto" w:sz="4"/>
-          <w:insideH w:val="single" w:color="auto" w:sz="4"/>
-          <w:insideV w:val="single" w:color="auto" w:sz="4"/>
+          <w:top w:val="single" w:color="auto" w:sz="12" w:space="0"/>
+          <w:left w:val="none" w:color="auto" w:sz="0" w:space="0"/>
+          <w:bottom w:val="single" w:color="auto" w:sz="12" w:space="0"/>
+          <w:right w:val="none" w:color="auto" w:sz="0" w:space="0"/>
+          <w:insideH w:val="none" w:color="auto" w:sz="0" w:space="0"/>
+          <w:insideV w:val="none" w:color="auto" w:sz="0" w:space="0"/>
         </w:tblBorders>
       </w:tblPr>
       <w:tblGrid>
@@ -16094,10 +15887,7 @@
           <w:tcPr>
             <w:tcW w:type="dxa" w:w="3008"/>
             <w:tcBorders>
-              <w:top w:val="single" w:color="CCCCCC" w:sz="1"/>
-              <w:left w:val="single" w:color="CCCCCC" w:sz="1"/>
-              <w:bottom w:val="single" w:color="CCCCCC" w:sz="1"/>
-              <w:right w:val="single" w:color="CCCCCC" w:sz="1"/>
+              <w:bottom w:val="single" w:sz="6" w:space="0" w:color="auto"/>
             </w:tcBorders>
             <w:shd w:fill="D5E8F0" w:val="clear"/>
             <w:tcMar>
@@ -16120,10 +15910,7 @@
           <w:tcPr>
             <w:tcW w:type="dxa" w:w="3008"/>
             <w:tcBorders>
-              <w:top w:val="single" w:color="CCCCCC" w:sz="1"/>
-              <w:left w:val="single" w:color="CCCCCC" w:sz="1"/>
-              <w:bottom w:val="single" w:color="CCCCCC" w:sz="1"/>
-              <w:right w:val="single" w:color="CCCCCC" w:sz="1"/>
+              <w:bottom w:val="single" w:sz="6" w:space="0" w:color="auto"/>
             </w:tcBorders>
             <w:shd w:fill="D5E8F0" w:val="clear"/>
             <w:tcMar>
@@ -16146,10 +15933,7 @@
           <w:tcPr>
             <w:tcW w:type="dxa" w:w="3008"/>
             <w:tcBorders>
-              <w:top w:val="single" w:color="CCCCCC" w:sz="1"/>
-              <w:left w:val="single" w:color="CCCCCC" w:sz="1"/>
-              <w:bottom w:val="single" w:color="CCCCCC" w:sz="1"/>
-              <w:right w:val="single" w:color="CCCCCC" w:sz="1"/>
+              <w:bottom w:val="single" w:sz="6" w:space="0" w:color="auto"/>
             </w:tcBorders>
             <w:shd w:fill="D5E8F0" w:val="clear"/>
             <w:tcMar>
@@ -16578,12 +16362,12 @@
       <w:tblPr>
         <w:tblW w:type="dxa" w:w="9026"/>
         <w:tblBorders>
-          <w:top w:val="single" w:color="auto" w:sz="4"/>
-          <w:left w:val="single" w:color="auto" w:sz="4"/>
-          <w:bottom w:val="single" w:color="auto" w:sz="4"/>
-          <w:right w:val="single" w:color="auto" w:sz="4"/>
-          <w:insideH w:val="single" w:color="auto" w:sz="4"/>
-          <w:insideV w:val="single" w:color="auto" w:sz="4"/>
+          <w:top w:val="single" w:color="auto" w:sz="12" w:space="0"/>
+          <w:left w:val="none" w:color="auto" w:sz="0" w:space="0"/>
+          <w:bottom w:val="single" w:color="auto" w:sz="12" w:space="0"/>
+          <w:right w:val="none" w:color="auto" w:sz="0" w:space="0"/>
+          <w:insideH w:val="none" w:color="auto" w:sz="0" w:space="0"/>
+          <w:insideV w:val="none" w:color="auto" w:sz="0" w:space="0"/>
         </w:tblBorders>
       </w:tblPr>
       <w:tblGrid>
@@ -16596,10 +16380,7 @@
           <w:tcPr>
             <w:tcW w:type="dxa" w:w="3008"/>
             <w:tcBorders>
-              <w:top w:val="single" w:color="CCCCCC" w:sz="1"/>
-              <w:left w:val="single" w:color="CCCCCC" w:sz="1"/>
-              <w:bottom w:val="single" w:color="CCCCCC" w:sz="1"/>
-              <w:right w:val="single" w:color="CCCCCC" w:sz="1"/>
+              <w:bottom w:val="single" w:sz="6" w:space="0" w:color="auto"/>
             </w:tcBorders>
             <w:shd w:fill="D5E8F0" w:val="clear"/>
             <w:tcMar>
@@ -16622,10 +16403,7 @@
           <w:tcPr>
             <w:tcW w:type="dxa" w:w="3008"/>
             <w:tcBorders>
-              <w:top w:val="single" w:color="CCCCCC" w:sz="1"/>
-              <w:left w:val="single" w:color="CCCCCC" w:sz="1"/>
-              <w:bottom w:val="single" w:color="CCCCCC" w:sz="1"/>
-              <w:right w:val="single" w:color="CCCCCC" w:sz="1"/>
+              <w:bottom w:val="single" w:sz="6" w:space="0" w:color="auto"/>
             </w:tcBorders>
             <w:shd w:fill="D5E8F0" w:val="clear"/>
             <w:tcMar>
@@ -16648,10 +16426,7 @@
           <w:tcPr>
             <w:tcW w:type="dxa" w:w="3008"/>
             <w:tcBorders>
-              <w:top w:val="single" w:color="CCCCCC" w:sz="1"/>
-              <w:left w:val="single" w:color="CCCCCC" w:sz="1"/>
-              <w:bottom w:val="single" w:color="CCCCCC" w:sz="1"/>
-              <w:right w:val="single" w:color="CCCCCC" w:sz="1"/>
+              <w:bottom w:val="single" w:sz="6" w:space="0" w:color="auto"/>
             </w:tcBorders>
             <w:shd w:fill="D5E8F0" w:val="clear"/>
             <w:tcMar>
@@ -17259,12 +17034,12 @@
       <w:tblPr>
         <w:tblW w:type="dxa" w:w="9026"/>
         <w:tblBorders>
-          <w:top w:val="single" w:color="auto" w:sz="4"/>
-          <w:left w:val="single" w:color="auto" w:sz="4"/>
-          <w:bottom w:val="single" w:color="auto" w:sz="4"/>
-          <w:right w:val="single" w:color="auto" w:sz="4"/>
-          <w:insideH w:val="single" w:color="auto" w:sz="4"/>
-          <w:insideV w:val="single" w:color="auto" w:sz="4"/>
+          <w:top w:val="single" w:color="auto" w:sz="12" w:space="0"/>
+          <w:left w:val="none" w:color="auto" w:sz="0" w:space="0"/>
+          <w:bottom w:val="single" w:color="auto" w:sz="12" w:space="0"/>
+          <w:right w:val="none" w:color="auto" w:sz="0" w:space="0"/>
+          <w:insideH w:val="none" w:color="auto" w:sz="0" w:space="0"/>
+          <w:insideV w:val="none" w:color="auto" w:sz="0" w:space="0"/>
         </w:tblBorders>
       </w:tblPr>
       <w:tblGrid>
@@ -17282,10 +17057,7 @@
           <w:tcPr>
             <w:tcW w:type="dxa" w:w="1128"/>
             <w:tcBorders>
-              <w:top w:val="single" w:color="CCCCCC" w:sz="1"/>
-              <w:left w:val="single" w:color="CCCCCC" w:sz="1"/>
-              <w:bottom w:val="single" w:color="CCCCCC" w:sz="1"/>
-              <w:right w:val="single" w:color="CCCCCC" w:sz="1"/>
+              <w:bottom w:val="single" w:sz="6" w:space="0" w:color="auto"/>
             </w:tcBorders>
             <w:shd w:fill="D5E8F0" w:val="clear"/>
             <w:tcMar>
@@ -17308,10 +17080,7 @@
           <w:tcPr>
             <w:tcW w:type="dxa" w:w="1128"/>
             <w:tcBorders>
-              <w:top w:val="single" w:color="CCCCCC" w:sz="1"/>
-              <w:left w:val="single" w:color="CCCCCC" w:sz="1"/>
-              <w:bottom w:val="single" w:color="CCCCCC" w:sz="1"/>
-              <w:right w:val="single" w:color="CCCCCC" w:sz="1"/>
+              <w:bottom w:val="single" w:sz="6" w:space="0" w:color="auto"/>
             </w:tcBorders>
             <w:shd w:fill="D5E8F0" w:val="clear"/>
             <w:tcMar>
@@ -17334,10 +17103,7 @@
           <w:tcPr>
             <w:tcW w:type="dxa" w:w="1128"/>
             <w:tcBorders>
-              <w:top w:val="single" w:color="CCCCCC" w:sz="1"/>
-              <w:left w:val="single" w:color="CCCCCC" w:sz="1"/>
-              <w:bottom w:val="single" w:color="CCCCCC" w:sz="1"/>
-              <w:right w:val="single" w:color="CCCCCC" w:sz="1"/>
+              <w:bottom w:val="single" w:sz="6" w:space="0" w:color="auto"/>
             </w:tcBorders>
             <w:shd w:fill="D5E8F0" w:val="clear"/>
             <w:tcMar>
@@ -17360,10 +17126,7 @@
           <w:tcPr>
             <w:tcW w:type="dxa" w:w="1128"/>
             <w:tcBorders>
-              <w:top w:val="single" w:color="CCCCCC" w:sz="1"/>
-              <w:left w:val="single" w:color="CCCCCC" w:sz="1"/>
-              <w:bottom w:val="single" w:color="CCCCCC" w:sz="1"/>
-              <w:right w:val="single" w:color="CCCCCC" w:sz="1"/>
+              <w:bottom w:val="single" w:sz="6" w:space="0" w:color="auto"/>
             </w:tcBorders>
             <w:shd w:fill="D5E8F0" w:val="clear"/>
             <w:tcMar>
@@ -17386,10 +17149,7 @@
           <w:tcPr>
             <w:tcW w:type="dxa" w:w="1128"/>
             <w:tcBorders>
-              <w:top w:val="single" w:color="CCCCCC" w:sz="1"/>
-              <w:left w:val="single" w:color="CCCCCC" w:sz="1"/>
-              <w:bottom w:val="single" w:color="CCCCCC" w:sz="1"/>
-              <w:right w:val="single" w:color="CCCCCC" w:sz="1"/>
+              <w:bottom w:val="single" w:sz="6" w:space="0" w:color="auto"/>
             </w:tcBorders>
             <w:shd w:fill="D5E8F0" w:val="clear"/>
             <w:tcMar>
@@ -17412,10 +17172,7 @@
           <w:tcPr>
             <w:tcW w:type="dxa" w:w="1128"/>
             <w:tcBorders>
-              <w:top w:val="single" w:color="CCCCCC" w:sz="1"/>
-              <w:left w:val="single" w:color="CCCCCC" w:sz="1"/>
-              <w:bottom w:val="single" w:color="CCCCCC" w:sz="1"/>
-              <w:right w:val="single" w:color="CCCCCC" w:sz="1"/>
+              <w:bottom w:val="single" w:sz="6" w:space="0" w:color="auto"/>
             </w:tcBorders>
             <w:shd w:fill="D5E8F0" w:val="clear"/>
             <w:tcMar>
@@ -17438,10 +17195,7 @@
           <w:tcPr>
             <w:tcW w:type="dxa" w:w="1128"/>
             <w:tcBorders>
-              <w:top w:val="single" w:color="CCCCCC" w:sz="1"/>
-              <w:left w:val="single" w:color="CCCCCC" w:sz="1"/>
-              <w:bottom w:val="single" w:color="CCCCCC" w:sz="1"/>
-              <w:right w:val="single" w:color="CCCCCC" w:sz="1"/>
+              <w:bottom w:val="single" w:sz="6" w:space="0" w:color="auto"/>
             </w:tcBorders>
             <w:shd w:fill="D5E8F0" w:val="clear"/>
             <w:tcMar>
@@ -17464,10 +17218,7 @@
           <w:tcPr>
             <w:tcW w:type="dxa" w:w="1128"/>
             <w:tcBorders>
-              <w:top w:val="single" w:color="CCCCCC" w:sz="1"/>
-              <w:left w:val="single" w:color="CCCCCC" w:sz="1"/>
-              <w:bottom w:val="single" w:color="CCCCCC" w:sz="1"/>
-              <w:right w:val="single" w:color="CCCCCC" w:sz="1"/>
+              <w:bottom w:val="single" w:sz="6" w:space="0" w:color="auto"/>
             </w:tcBorders>
             <w:shd w:fill="D5E8F0" w:val="clear"/>
             <w:tcMar>
@@ -17929,12 +17680,12 @@
       <w:tblPr>
         <w:tblW w:type="dxa" w:w="9026"/>
         <w:tblBorders>
-          <w:top w:val="single" w:color="auto" w:sz="4"/>
-          <w:left w:val="single" w:color="auto" w:sz="4"/>
-          <w:bottom w:val="single" w:color="auto" w:sz="4"/>
-          <w:right w:val="single" w:color="auto" w:sz="4"/>
-          <w:insideH w:val="single" w:color="auto" w:sz="4"/>
-          <w:insideV w:val="single" w:color="auto" w:sz="4"/>
+          <w:top w:val="single" w:color="auto" w:sz="12" w:space="0"/>
+          <w:left w:val="none" w:color="auto" w:sz="0" w:space="0"/>
+          <w:bottom w:val="single" w:color="auto" w:sz="12" w:space="0"/>
+          <w:right w:val="none" w:color="auto" w:sz="0" w:space="0"/>
+          <w:insideH w:val="none" w:color="auto" w:sz="0" w:space="0"/>
+          <w:insideV w:val="none" w:color="auto" w:sz="0" w:space="0"/>
         </w:tblBorders>
       </w:tblPr>
       <w:tblGrid>
@@ -17948,10 +17699,7 @@
           <w:tcPr>
             <w:tcW w:type="dxa" w:w="2256"/>
             <w:tcBorders>
-              <w:top w:val="single" w:color="CCCCCC" w:sz="1"/>
-              <w:left w:val="single" w:color="CCCCCC" w:sz="1"/>
-              <w:bottom w:val="single" w:color="CCCCCC" w:sz="1"/>
-              <w:right w:val="single" w:color="CCCCCC" w:sz="1"/>
+              <w:bottom w:val="single" w:sz="6" w:space="0" w:color="auto"/>
             </w:tcBorders>
             <w:shd w:fill="D5E8F0" w:val="clear"/>
             <w:tcMar>
@@ -17974,10 +17722,7 @@
           <w:tcPr>
             <w:tcW w:type="dxa" w:w="2256"/>
             <w:tcBorders>
-              <w:top w:val="single" w:color="CCCCCC" w:sz="1"/>
-              <w:left w:val="single" w:color="CCCCCC" w:sz="1"/>
-              <w:bottom w:val="single" w:color="CCCCCC" w:sz="1"/>
-              <w:right w:val="single" w:color="CCCCCC" w:sz="1"/>
+              <w:bottom w:val="single" w:sz="6" w:space="0" w:color="auto"/>
             </w:tcBorders>
             <w:shd w:fill="D5E8F0" w:val="clear"/>
             <w:tcMar>
@@ -18000,10 +17745,7 @@
           <w:tcPr>
             <w:tcW w:type="dxa" w:w="2256"/>
             <w:tcBorders>
-              <w:top w:val="single" w:color="CCCCCC" w:sz="1"/>
-              <w:left w:val="single" w:color="CCCCCC" w:sz="1"/>
-              <w:bottom w:val="single" w:color="CCCCCC" w:sz="1"/>
-              <w:right w:val="single" w:color="CCCCCC" w:sz="1"/>
+              <w:bottom w:val="single" w:sz="6" w:space="0" w:color="auto"/>
             </w:tcBorders>
             <w:shd w:fill="D5E8F0" w:val="clear"/>
             <w:tcMar>
@@ -18026,10 +17768,7 @@
           <w:tcPr>
             <w:tcW w:type="dxa" w:w="2256"/>
             <w:tcBorders>
-              <w:top w:val="single" w:color="CCCCCC" w:sz="1"/>
-              <w:left w:val="single" w:color="CCCCCC" w:sz="1"/>
-              <w:bottom w:val="single" w:color="CCCCCC" w:sz="1"/>
-              <w:right w:val="single" w:color="CCCCCC" w:sz="1"/>
+              <w:bottom w:val="single" w:sz="6" w:space="0" w:color="auto"/>
             </w:tcBorders>
             <w:shd w:fill="D5E8F0" w:val="clear"/>
             <w:tcMar>
@@ -18289,12 +18028,12 @@
       <w:tblPr>
         <w:tblW w:type="dxa" w:w="9026"/>
         <w:tblBorders>
-          <w:top w:val="single" w:color="auto" w:sz="4"/>
-          <w:left w:val="single" w:color="auto" w:sz="4"/>
-          <w:bottom w:val="single" w:color="auto" w:sz="4"/>
-          <w:right w:val="single" w:color="auto" w:sz="4"/>
-          <w:insideH w:val="single" w:color="auto" w:sz="4"/>
-          <w:insideV w:val="single" w:color="auto" w:sz="4"/>
+          <w:top w:val="single" w:color="auto" w:sz="12" w:space="0"/>
+          <w:left w:val="none" w:color="auto" w:sz="0" w:space="0"/>
+          <w:bottom w:val="single" w:color="auto" w:sz="12" w:space="0"/>
+          <w:right w:val="none" w:color="auto" w:sz="0" w:space="0"/>
+          <w:insideH w:val="none" w:color="auto" w:sz="0" w:space="0"/>
+          <w:insideV w:val="none" w:color="auto" w:sz="0" w:space="0"/>
         </w:tblBorders>
       </w:tblPr>
       <w:tblGrid>
@@ -18307,10 +18046,7 @@
           <w:tcPr>
             <w:tcW w:type="dxa" w:w="3008"/>
             <w:tcBorders>
-              <w:top w:val="single" w:color="CCCCCC" w:sz="1"/>
-              <w:left w:val="single" w:color="CCCCCC" w:sz="1"/>
-              <w:bottom w:val="single" w:color="CCCCCC" w:sz="1"/>
-              <w:right w:val="single" w:color="CCCCCC" w:sz="1"/>
+              <w:bottom w:val="single" w:sz="6" w:space="0" w:color="auto"/>
             </w:tcBorders>
             <w:shd w:fill="D5E8F0" w:val="clear"/>
             <w:tcMar>
@@ -18333,10 +18069,7 @@
           <w:tcPr>
             <w:tcW w:type="dxa" w:w="3008"/>
             <w:tcBorders>
-              <w:top w:val="single" w:color="CCCCCC" w:sz="1"/>
-              <w:left w:val="single" w:color="CCCCCC" w:sz="1"/>
-              <w:bottom w:val="single" w:color="CCCCCC" w:sz="1"/>
-              <w:right w:val="single" w:color="CCCCCC" w:sz="1"/>
+              <w:bottom w:val="single" w:sz="6" w:space="0" w:color="auto"/>
             </w:tcBorders>
             <w:shd w:fill="D5E8F0" w:val="clear"/>
             <w:tcMar>
@@ -18359,10 +18092,7 @@
           <w:tcPr>
             <w:tcW w:type="dxa" w:w="3008"/>
             <w:tcBorders>
-              <w:top w:val="single" w:color="CCCCCC" w:sz="1"/>
-              <w:left w:val="single" w:color="CCCCCC" w:sz="1"/>
-              <w:bottom w:val="single" w:color="CCCCCC" w:sz="1"/>
-              <w:right w:val="single" w:color="CCCCCC" w:sz="1"/>
+              <w:bottom w:val="single" w:sz="6" w:space="0" w:color="auto"/>
             </w:tcBorders>
             <w:shd w:fill="D5E8F0" w:val="clear"/>
             <w:tcMar>
@@ -19005,12 +18735,12 @@
       <w:tblPr>
         <w:tblW w:type="dxa" w:w="9026"/>
         <w:tblBorders>
-          <w:top w:val="single" w:color="auto" w:sz="4"/>
-          <w:left w:val="single" w:color="auto" w:sz="4"/>
-          <w:bottom w:val="single" w:color="auto" w:sz="4"/>
-          <w:right w:val="single" w:color="auto" w:sz="4"/>
-          <w:insideH w:val="single" w:color="auto" w:sz="4"/>
-          <w:insideV w:val="single" w:color="auto" w:sz="4"/>
+          <w:top w:val="single" w:color="auto" w:sz="12" w:space="0"/>
+          <w:left w:val="none" w:color="auto" w:sz="0" w:space="0"/>
+          <w:bottom w:val="single" w:color="auto" w:sz="12" w:space="0"/>
+          <w:right w:val="none" w:color="auto" w:sz="0" w:space="0"/>
+          <w:insideH w:val="none" w:color="auto" w:sz="0" w:space="0"/>
+          <w:insideV w:val="none" w:color="auto" w:sz="0" w:space="0"/>
         </w:tblBorders>
       </w:tblPr>
       <w:tblGrid>
@@ -19023,10 +18753,7 @@
           <w:tcPr>
             <w:tcW w:type="dxa" w:w="3008"/>
             <w:tcBorders>
-              <w:top w:val="single" w:color="CCCCCC" w:sz="1"/>
-              <w:left w:val="single" w:color="CCCCCC" w:sz="1"/>
-              <w:bottom w:val="single" w:color="CCCCCC" w:sz="1"/>
-              <w:right w:val="single" w:color="CCCCCC" w:sz="1"/>
+              <w:bottom w:val="single" w:sz="6" w:space="0" w:color="auto"/>
             </w:tcBorders>
             <w:shd w:fill="D5E8F0" w:val="clear"/>
             <w:tcMar>
@@ -19049,10 +18776,7 @@
           <w:tcPr>
             <w:tcW w:type="dxa" w:w="3008"/>
             <w:tcBorders>
-              <w:top w:val="single" w:color="CCCCCC" w:sz="1"/>
-              <w:left w:val="single" w:color="CCCCCC" w:sz="1"/>
-              <w:bottom w:val="single" w:color="CCCCCC" w:sz="1"/>
-              <w:right w:val="single" w:color="CCCCCC" w:sz="1"/>
+              <w:bottom w:val="single" w:sz="6" w:space="0" w:color="auto"/>
             </w:tcBorders>
             <w:shd w:fill="D5E8F0" w:val="clear"/>
             <w:tcMar>
@@ -19075,10 +18799,7 @@
           <w:tcPr>
             <w:tcW w:type="dxa" w:w="3008"/>
             <w:tcBorders>
-              <w:top w:val="single" w:color="CCCCCC" w:sz="1"/>
-              <w:left w:val="single" w:color="CCCCCC" w:sz="1"/>
-              <w:bottom w:val="single" w:color="CCCCCC" w:sz="1"/>
-              <w:right w:val="single" w:color="CCCCCC" w:sz="1"/>
+              <w:bottom w:val="single" w:sz="6" w:space="0" w:color="auto"/>
             </w:tcBorders>
             <w:shd w:fill="D5E8F0" w:val="clear"/>
             <w:tcMar>
@@ -19313,12 +19034,12 @@
       <w:tblPr>
         <w:tblW w:type="dxa" w:w="9026"/>
         <w:tblBorders>
-          <w:top w:val="single" w:color="auto" w:sz="4"/>
-          <w:left w:val="single" w:color="auto" w:sz="4"/>
-          <w:bottom w:val="single" w:color="auto" w:sz="4"/>
-          <w:right w:val="single" w:color="auto" w:sz="4"/>
-          <w:insideH w:val="single" w:color="auto" w:sz="4"/>
-          <w:insideV w:val="single" w:color="auto" w:sz="4"/>
+          <w:top w:val="single" w:color="auto" w:sz="12" w:space="0"/>
+          <w:left w:val="none" w:color="auto" w:sz="0" w:space="0"/>
+          <w:bottom w:val="single" w:color="auto" w:sz="12" w:space="0"/>
+          <w:right w:val="none" w:color="auto" w:sz="0" w:space="0"/>
+          <w:insideH w:val="none" w:color="auto" w:sz="0" w:space="0"/>
+          <w:insideV w:val="none" w:color="auto" w:sz="0" w:space="0"/>
         </w:tblBorders>
       </w:tblPr>
       <w:tblGrid>
@@ -19332,10 +19053,7 @@
           <w:tcPr>
             <w:tcW w:type="dxa" w:w="2256"/>
             <w:tcBorders>
-              <w:top w:val="single" w:color="CCCCCC" w:sz="1"/>
-              <w:left w:val="single" w:color="CCCCCC" w:sz="1"/>
-              <w:bottom w:val="single" w:color="CCCCCC" w:sz="1"/>
-              <w:right w:val="single" w:color="CCCCCC" w:sz="1"/>
+              <w:bottom w:val="single" w:sz="6" w:space="0" w:color="auto"/>
             </w:tcBorders>
             <w:shd w:fill="D5E8F0" w:val="clear"/>
             <w:tcMar>
@@ -19358,10 +19076,7 @@
           <w:tcPr>
             <w:tcW w:type="dxa" w:w="2256"/>
             <w:tcBorders>
-              <w:top w:val="single" w:color="CCCCCC" w:sz="1"/>
-              <w:left w:val="single" w:color="CCCCCC" w:sz="1"/>
-              <w:bottom w:val="single" w:color="CCCCCC" w:sz="1"/>
-              <w:right w:val="single" w:color="CCCCCC" w:sz="1"/>
+              <w:bottom w:val="single" w:sz="6" w:space="0" w:color="auto"/>
             </w:tcBorders>
             <w:shd w:fill="D5E8F0" w:val="clear"/>
             <w:tcMar>
@@ -19384,10 +19099,7 @@
           <w:tcPr>
             <w:tcW w:type="dxa" w:w="2256"/>
             <w:tcBorders>
-              <w:top w:val="single" w:color="CCCCCC" w:sz="1"/>
-              <w:left w:val="single" w:color="CCCCCC" w:sz="1"/>
-              <w:bottom w:val="single" w:color="CCCCCC" w:sz="1"/>
-              <w:right w:val="single" w:color="CCCCCC" w:sz="1"/>
+              <w:bottom w:val="single" w:sz="6" w:space="0" w:color="auto"/>
             </w:tcBorders>
             <w:shd w:fill="D5E8F0" w:val="clear"/>
             <w:tcMar>
@@ -19410,10 +19122,7 @@
           <w:tcPr>
             <w:tcW w:type="dxa" w:w="2256"/>
             <w:tcBorders>
-              <w:top w:val="single" w:color="CCCCCC" w:sz="1"/>
-              <w:left w:val="single" w:color="CCCCCC" w:sz="1"/>
-              <w:bottom w:val="single" w:color="CCCCCC" w:sz="1"/>
-              <w:right w:val="single" w:color="CCCCCC" w:sz="1"/>
+              <w:bottom w:val="single" w:sz="6" w:space="0" w:color="auto"/>
             </w:tcBorders>
             <w:shd w:fill="D5E8F0" w:val="clear"/>
             <w:tcMar>
@@ -19777,12 +19486,12 @@
       <w:tblPr>
         <w:tblW w:type="dxa" w:w="9026"/>
         <w:tblBorders>
-          <w:top w:val="single" w:color="auto" w:sz="4"/>
-          <w:left w:val="single" w:color="auto" w:sz="4"/>
-          <w:bottom w:val="single" w:color="auto" w:sz="4"/>
-          <w:right w:val="single" w:color="auto" w:sz="4"/>
-          <w:insideH w:val="single" w:color="auto" w:sz="4"/>
-          <w:insideV w:val="single" w:color="auto" w:sz="4"/>
+          <w:top w:val="single" w:color="auto" w:sz="12" w:space="0"/>
+          <w:left w:val="none" w:color="auto" w:sz="0" w:space="0"/>
+          <w:bottom w:val="single" w:color="auto" w:sz="12" w:space="0"/>
+          <w:right w:val="none" w:color="auto" w:sz="0" w:space="0"/>
+          <w:insideH w:val="none" w:color="auto" w:sz="0" w:space="0"/>
+          <w:insideV w:val="none" w:color="auto" w:sz="0" w:space="0"/>
         </w:tblBorders>
       </w:tblPr>
       <w:tblGrid>
@@ -19795,10 +19504,7 @@
           <w:tcPr>
             <w:tcW w:type="dxa" w:w="3008"/>
             <w:tcBorders>
-              <w:top w:val="single" w:color="CCCCCC" w:sz="1"/>
-              <w:left w:val="single" w:color="CCCCCC" w:sz="1"/>
-              <w:bottom w:val="single" w:color="CCCCCC" w:sz="1"/>
-              <w:right w:val="single" w:color="CCCCCC" w:sz="1"/>
+              <w:bottom w:val="single" w:sz="6" w:space="0" w:color="auto"/>
             </w:tcBorders>
             <w:shd w:fill="D5E8F0" w:val="clear"/>
             <w:tcMar>
@@ -19821,10 +19527,7 @@
           <w:tcPr>
             <w:tcW w:type="dxa" w:w="3008"/>
             <w:tcBorders>
-              <w:top w:val="single" w:color="CCCCCC" w:sz="1"/>
-              <w:left w:val="single" w:color="CCCCCC" w:sz="1"/>
-              <w:bottom w:val="single" w:color="CCCCCC" w:sz="1"/>
-              <w:right w:val="single" w:color="CCCCCC" w:sz="1"/>
+              <w:bottom w:val="single" w:sz="6" w:space="0" w:color="auto"/>
             </w:tcBorders>
             <w:shd w:fill="D5E8F0" w:val="clear"/>
             <w:tcMar>
@@ -19847,10 +19550,7 @@
           <w:tcPr>
             <w:tcW w:type="dxa" w:w="3008"/>
             <w:tcBorders>
-              <w:top w:val="single" w:color="CCCCCC" w:sz="1"/>
-              <w:left w:val="single" w:color="CCCCCC" w:sz="1"/>
-              <w:bottom w:val="single" w:color="CCCCCC" w:sz="1"/>
-              <w:right w:val="single" w:color="CCCCCC" w:sz="1"/>
+              <w:bottom w:val="single" w:sz="6" w:space="0" w:color="auto"/>
             </w:tcBorders>
             <w:shd w:fill="D5E8F0" w:val="clear"/>
             <w:tcMar>

</xml_diff>